<commit_message>
README: how to get your own Google key, with links and costs
Step-by-step Google Cloud setup (project, billing, the two APIs, the key,
restricting it, a budget alert), the free monthly allowances, and links
to it from the exercise READMEs and the web pages.
</commit_message>
<xml_diff>
--- a/docs/0 - Internet Architecture.docx
+++ b/docs/0 - Internet Architecture.docx
@@ -302,7 +302,7 @@
             </w:tcMar>
           </w:tcPr>
           <w:p>
-            <w:hyperlink w:history="1" r:id="rIdt_prfhecs2zhv8b-d_p9h">
+            <w:hyperlink w:history="1" r:id="rIdqgkuq0ri8yizxfjyuogpn">
               <w:r>
                 <w:rPr>
                   <w:rFonts w:ascii="Arial" w:cs="Arial" w:eastAsia="Arial" w:hAnsi="Arial"/>
@@ -449,7 +449,7 @@
             </w:tcMar>
           </w:tcPr>
           <w:p>
-            <w:hyperlink w:history="1" r:id="rIdgpwcfi6spjkhwch2nggfi">
+            <w:hyperlink w:history="1" r:id="rId6yvvbrt9mzvsdohrguna8">
               <w:r>
                 <w:rPr>
                   <w:rFonts w:ascii="Arial" w:cs="Arial" w:eastAsia="Arial" w:hAnsi="Arial"/>
@@ -596,7 +596,7 @@
             </w:tcMar>
           </w:tcPr>
           <w:p>
-            <w:hyperlink w:history="1" r:id="rIdzjqg2ltyul1na9awz_nku">
+            <w:hyperlink w:history="1" r:id="rIdiquyhjem1xrj_6oq1ju99">
               <w:r>
                 <w:rPr>
                   <w:rFonts w:ascii="Arial" w:cs="Arial" w:eastAsia="Arial" w:hAnsi="Arial"/>
@@ -681,7 +681,7 @@
         </w:rPr>
         <w:t xml:space="preserve">, the editor where you'll do everything: </w:t>
       </w:r>
-      <w:hyperlink w:history="1" r:id="rIdinq7dns5uqgsjl9tho-2l">
+      <w:hyperlink w:history="1" r:id="rIdn0w4s_qdbxrkfnmjwoyjr">
         <w:r>
           <w:rPr>
             <w:rFonts w:ascii="Arial" w:cs="Arial" w:eastAsia="Arial" w:hAnsi="Arial"/>
@@ -714,7 +714,7 @@
         </w:rPr>
         <w:t xml:space="preserve">, which runs JavaScript files on your computer: </w:t>
       </w:r>
-      <w:hyperlink w:history="1" r:id="rIdjh-rvq-tt3cggg1sqe8c7">
+      <w:hyperlink w:history="1" r:id="rIdlkh8kgsn7jyrstzotzli9">
         <w:r>
           <w:rPr>
             <w:rFonts w:ascii="Arial" w:cs="Arial" w:eastAsia="Arial" w:hAnsi="Arial"/>
@@ -1014,7 +1014,19 @@
         <w:rPr>
           <w:rFonts w:ascii="Arial" w:cs="Arial" w:eastAsia="Arial" w:hAnsi="Arial"/>
         </w:rPr>
-        <w:t xml:space="preserve"> (a kind of password). Your teacher gives it to you.</w:t>
+        <w:t xml:space="preserve"> (a kind of password). Your teacher may give you one, or you can </w:t>
+      </w:r>
+      <w:r>
+        <w:rPr>
+          <w:rFonts w:ascii="Arial" w:cs="Arial" w:eastAsia="Arial" w:hAnsi="Arial"/>
+        </w:rPr>
+        <w:t xml:space="preserve">make your own</w:t>
+      </w:r>
+      <w:r>
+        <w:rPr>
+          <w:rFonts w:ascii="Arial" w:cs="Arial" w:eastAsia="Arial" w:hAnsi="Arial"/>
+        </w:rPr>
+        <w:t xml:space="preserve"> (about 15 minutes). Exercise 3 needs no key.</w:t>
       </w:r>
     </w:p>
     <w:p>
@@ -1142,96 +1154,21 @@
     </w:p>
     <w:p>
       <w:pPr>
-        <w:pStyle w:val="Heading1"/>
-      </w:pPr>
-      <w:r>
-        <w:rPr>
-          <w:rFonts w:ascii="Arial" w:cs="Arial" w:eastAsia="Arial" w:hAnsi="Arial"/>
-        </w:rPr>
-        <w:t xml:space="preserve">5. Run an exercise</w:t>
-      </w:r>
-    </w:p>
-    <w:p>
-      <w:r>
-        <w:rPr>
-          <w:rFonts w:ascii="Arial" w:cs="Arial" w:eastAsia="Arial" w:hAnsi="Arial"/>
-        </w:rPr>
-        <w:t xml:space="preserve">Every exercise works the same way. For example, exercise 1:</w:t>
-      </w:r>
-    </w:p>
-    <w:p>
-      <w:pPr>
-        <w:shd w:fill="F3F3F3" w:color="auto" w:val="clear"/>
-        <w:spacing w:after="0" w:before="80"/>
-        <w:ind w:left="200"/>
-      </w:pPr>
-      <w:r>
-        <w:rPr>
-          <w:rFonts w:ascii="Courier New" w:cs="Courier New" w:eastAsia="Courier New" w:hAnsi="Courier New"/>
-          <w:sz w:val="20"/>
-          <w:szCs w:val="20"/>
-        </w:rPr>
-        <w:t xml:space="preserve">cd 1-3Dminus1</w:t>
-      </w:r>
-    </w:p>
-    <w:p>
-      <w:pPr>
-        <w:shd w:fill="F3F3F3" w:color="auto" w:val="clear"/>
-        <w:spacing w:after="0" w:before="0"/>
-        <w:ind w:left="200"/>
-      </w:pPr>
-      <w:r>
-        <w:rPr>
-          <w:rFonts w:ascii="Courier New" w:cs="Courier New" w:eastAsia="Courier New" w:hAnsi="Courier New"/>
-          <w:sz w:val="20"/>
-          <w:szCs w:val="20"/>
-        </w:rPr>
-        <w:t xml:space="preserve">node 1-find-tiles.js</w:t>
-      </w:r>
-    </w:p>
-    <w:p>
-      <w:pPr>
-        <w:shd w:fill="F3F3F3" w:color="auto" w:val="clear"/>
-        <w:spacing w:after="0" w:before="0"/>
-        <w:ind w:left="200"/>
-      </w:pPr>
-      <w:r>
-        <w:rPr>
-          <w:rFonts w:ascii="Courier New" w:cs="Courier New" w:eastAsia="Courier New" w:hAnsi="Courier New"/>
-          <w:sz w:val="20"/>
-          <w:szCs w:val="20"/>
-        </w:rPr>
-        <w:t xml:space="preserve">node 2-get-textures.js</w:t>
-      </w:r>
-    </w:p>
-    <w:p>
-      <w:pPr>
-        <w:shd w:fill="F3F3F3" w:color="auto" w:val="clear"/>
-        <w:spacing w:after="0" w:before="0"/>
-        <w:ind w:left="200"/>
-      </w:pPr>
-      <w:r>
-        <w:rPr>
-          <w:rFonts w:ascii="Courier New" w:cs="Courier New" w:eastAsia="Courier New" w:hAnsi="Courier New"/>
-          <w:sz w:val="20"/>
-          <w:szCs w:val="20"/>
-        </w:rPr>
-        <w:t xml:space="preserve">node 3-make-map.js</w:t>
-      </w:r>
-    </w:p>
-    <w:p>
-      <w:pPr>
-        <w:shd w:fill="F3F3F3" w:color="auto" w:val="clear"/>
-        <w:spacing w:after="160" w:before="0"/>
-        <w:ind w:left="200"/>
-      </w:pPr>
-      <w:r>
-        <w:rPr>
-          <w:rFonts w:ascii="Courier New" w:cs="Courier New" w:eastAsia="Courier New" w:hAnsi="Courier New"/>
-          <w:sz w:val="20"/>
-          <w:szCs w:val="20"/>
-        </w:rPr>
-        <w:t xml:space="preserve">node 4-name-squares.js</w:t>
+        <w:pStyle w:val="Heading2"/>
+      </w:pPr>
+      <w:r>
+        <w:rPr>
+          <w:rFonts w:ascii="Arial" w:cs="Arial" w:eastAsia="Arial" w:hAnsi="Arial"/>
+        </w:rPr>
+        <w:t xml:space="preserve">Get your own Google key</w:t>
+      </w:r>
+    </w:p>
+    <w:p>
+      <w:r>
+        <w:rPr>
+          <w:rFonts w:ascii="Arial" w:cs="Arial" w:eastAsia="Arial" w:hAnsi="Arial"/>
+        </w:rPr>
+        <w:t xml:space="preserve">You need a Google account and a credit or debit card. Google asks for a card even though normal use of these exercises stays inside the free monthly allowance (see the costs below).</w:t>
       </w:r>
     </w:p>
     <w:p>
@@ -1244,17 +1181,33 @@
       </w:pPr>
       <w:r>
         <w:rPr>
-          <w:rFonts w:ascii="Courier New" w:cs="Courier New" w:eastAsia="Courier New" w:hAnsi="Courier New"/>
-          <w:sz w:val="20"/>
-          <w:szCs w:val="20"/>
-        </w:rPr>
-        <w:t xml:space="preserve">cd 1-3Dminus1</w:t>
-      </w:r>
-      <w:r>
-        <w:rPr>
-          <w:rFonts w:ascii="Arial" w:cs="Arial" w:eastAsia="Arial" w:hAnsi="Arial"/>
-        </w:rPr>
-        <w:t xml:space="preserve"> means "go into the folder 1-3Dminus1". Do it once, then run the steps.</w:t>
+          <w:rFonts w:ascii="Arial" w:cs="Arial" w:eastAsia="Arial" w:hAnsi="Arial"/>
+          <w:b/>
+          <w:bCs/>
+        </w:rPr>
+        <w:t xml:space="preserve">Open Google Cloud.</w:t>
+      </w:r>
+      <w:r>
+        <w:rPr>
+          <w:rFonts w:ascii="Arial" w:cs="Arial" w:eastAsia="Arial" w:hAnsi="Arial"/>
+        </w:rPr>
+        <w:t xml:space="preserve"> Go to </w:t>
+      </w:r>
+      <w:hyperlink w:history="1" r:id="rIdj7yfx6gfqwdds3thdwm8t">
+        <w:r>
+          <w:rPr>
+            <w:rFonts w:ascii="Arial" w:cs="Arial" w:eastAsia="Arial" w:hAnsi="Arial"/>
+            <w:color w:val="0000FF"/>
+            <w:u w:val="single"/>
+          </w:rPr>
+          <w:t xml:space="preserve">https://console.cloud.google.com</w:t>
+        </w:r>
+      </w:hyperlink>
+      <w:r>
+        <w:rPr>
+          <w:rFonts w:ascii="Arial" w:cs="Arial" w:eastAsia="Arial" w:hAnsi="Arial"/>
+        </w:rPr>
+        <w:t xml:space="preserve"> and sign in with your Google account. The first time, accept the terms of service.</w:t>
       </w:r>
     </w:p>
     <w:p>
@@ -1268,8 +1221,32 @@
       <w:r>
         <w:rPr>
           <w:rFonts w:ascii="Arial" w:cs="Arial" w:eastAsia="Arial" w:hAnsi="Arial"/>
-        </w:rPr>
-        <w:t xml:space="preserve">Each </w:t>
+          <w:b/>
+          <w:bCs/>
+        </w:rPr>
+        <w:t xml:space="preserve">Make a project</w:t>
+      </w:r>
+      <w:r>
+        <w:rPr>
+          <w:rFonts w:ascii="Arial" w:cs="Arial" w:eastAsia="Arial" w:hAnsi="Arial"/>
+        </w:rPr>
+        <w:t xml:space="preserve"> (a folder for your keys and settings): </w:t>
+      </w:r>
+      <w:hyperlink w:history="1" r:id="rIdulxjrgym_q7niganrboty">
+        <w:r>
+          <w:rPr>
+            <w:rFonts w:ascii="Arial" w:cs="Arial" w:eastAsia="Arial" w:hAnsi="Arial"/>
+            <w:color w:val="0000FF"/>
+            <w:u w:val="single"/>
+          </w:rPr>
+          <w:t xml:space="preserve">https://console.cloud.google.com/projectcreate</w:t>
+        </w:r>
+      </w:hyperlink>
+      <w:r>
+        <w:rPr>
+          <w:rFonts w:ascii="Arial" w:cs="Arial" w:eastAsia="Arial" w:hAnsi="Arial"/>
+        </w:rPr>
+        <w:t xml:space="preserve"> Name it e.g. </w:t>
       </w:r>
       <w:r>
         <w:rPr>
@@ -1277,27 +1254,27 @@
           <w:sz w:val="20"/>
           <w:szCs w:val="20"/>
         </w:rPr>
-        <w:t xml:space="preserve">node …</w:t>
-      </w:r>
-      <w:r>
-        <w:rPr>
-          <w:rFonts w:ascii="Arial" w:cs="Arial" w:eastAsia="Arial" w:hAnsi="Arial"/>
-        </w:rPr>
-        <w:t xml:space="preserve"> line runs one step. Wait until it says </w:t>
-      </w:r>
-      <w:r>
-        <w:rPr>
-          <w:rFonts w:ascii="Arial" w:cs="Arial" w:eastAsia="Arial" w:hAnsi="Arial"/>
-          <w:b/>
-          <w:bCs/>
-        </w:rPr>
-        <w:t xml:space="preserve">Next: …</w:t>
-      </w:r>
-      <w:r>
-        <w:rPr>
-          <w:rFonts w:ascii="Arial" w:cs="Arial" w:eastAsia="Arial" w:hAnsi="Arial"/>
-        </w:rPr>
-        <w:t xml:space="preserve"> before running the next one.</w:t>
+        <w:t xml:space="preserve">internet-architecture</w:t>
+      </w:r>
+      <w:r>
+        <w:rPr>
+          <w:rFonts w:ascii="Arial" w:cs="Arial" w:eastAsia="Arial" w:hAnsi="Arial"/>
+        </w:rPr>
+        <w:t xml:space="preserve"> and click </w:t>
+      </w:r>
+      <w:r>
+        <w:rPr>
+          <w:rFonts w:ascii="Arial" w:cs="Arial" w:eastAsia="Arial" w:hAnsi="Arial"/>
+          <w:b/>
+          <w:bCs/>
+        </w:rPr>
+        <w:t xml:space="preserve">Create</w:t>
+      </w:r>
+      <w:r>
+        <w:rPr>
+          <w:rFonts w:ascii="Arial" w:cs="Arial" w:eastAsia="Arial" w:hAnsi="Arial"/>
+        </w:rPr>
+        <w:t xml:space="preserve">. Wait a few seconds, then check that your new project is selected in the menu at the top left of the page.</w:t>
       </w:r>
     </w:p>
     <w:p>
@@ -1311,64 +1288,60 @@
       <w:r>
         <w:rPr>
           <w:rFonts w:ascii="Arial" w:cs="Arial" w:eastAsia="Arial" w:hAnsi="Arial"/>
-        </w:rPr>
-        <w:t xml:space="preserve">Results appear in the exercise's </w:t>
-      </w:r>
-      <w:r>
-        <w:rPr>
-          <w:rFonts w:ascii="Arial" w:cs="Arial" w:eastAsia="Arial" w:hAnsi="Arial"/>
-          <w:b/>
-          <w:bCs/>
-        </w:rPr>
-        <w:t xml:space="preserve">`output`</w:t>
-      </w:r>
-      <w:r>
-        <w:rPr>
-          <w:rFonts w:ascii="Arial" w:cs="Arial" w:eastAsia="Arial" w:hAnsi="Arial"/>
-        </w:rPr>
-        <w:t xml:space="preserve"> folder, visible in VS Code's file list. Click an image to see it. For the video, the table (</w:t>
-      </w:r>
-      <w:r>
-        <w:rPr>
-          <w:rFonts w:ascii="Courier New" w:cs="Courier New" w:eastAsia="Courier New" w:hAnsi="Courier New"/>
-          <w:sz w:val="20"/>
-          <w:szCs w:val="20"/>
-        </w:rPr>
-        <w:t xml:space="preserve">.csv</w:t>
-      </w:r>
-      <w:r>
-        <w:rPr>
-          <w:rFonts w:ascii="Arial" w:cs="Arial" w:eastAsia="Arial" w:hAnsi="Arial"/>
-        </w:rPr>
-        <w:t xml:space="preserve">) or to see all images at once: right-click the file or folder → </w:t>
-      </w:r>
-      <w:r>
-        <w:rPr>
-          <w:rFonts w:ascii="Arial" w:cs="Arial" w:eastAsia="Arial" w:hAnsi="Arial"/>
-          <w:b/>
-          <w:bCs/>
-        </w:rPr>
-        <w:t xml:space="preserve">Reveal in Finder</w:t>
-      </w:r>
-      <w:r>
-        <w:rPr>
-          <w:rFonts w:ascii="Arial" w:cs="Arial" w:eastAsia="Arial" w:hAnsi="Arial"/>
-        </w:rPr>
-        <w:t xml:space="preserve"> (Mac) / </w:t>
-      </w:r>
-      <w:r>
-        <w:rPr>
-          <w:rFonts w:ascii="Arial" w:cs="Arial" w:eastAsia="Arial" w:hAnsi="Arial"/>
-          <w:b/>
-          <w:bCs/>
-        </w:rPr>
-        <w:t xml:space="preserve">Reveal in File Explorer</w:t>
-      </w:r>
-      <w:r>
-        <w:rPr>
-          <w:rFonts w:ascii="Arial" w:cs="Arial" w:eastAsia="Arial" w:hAnsi="Arial"/>
-        </w:rPr>
-        <w:t xml:space="preserve"> (Windows).</w:t>
+          <w:b/>
+          <w:bCs/>
+        </w:rPr>
+        <w:t xml:space="preserve">Turn on billing:</w:t>
+      </w:r>
+      <w:r>
+        <w:rPr>
+          <w:rFonts w:ascii="Arial" w:cs="Arial" w:eastAsia="Arial" w:hAnsi="Arial"/>
+        </w:rPr>
+        <w:t xml:space="preserve"> </w:t>
+      </w:r>
+      <w:hyperlink w:history="1" r:id="rIdfz-a92ku5g8hhpcfe42ue">
+        <w:r>
+          <w:rPr>
+            <w:rFonts w:ascii="Arial" w:cs="Arial" w:eastAsia="Arial" w:hAnsi="Arial"/>
+            <w:color w:val="0000FF"/>
+            <w:u w:val="single"/>
+          </w:rPr>
+          <w:t xml:space="preserve">https://console.cloud.google.com/billing</w:t>
+        </w:r>
+      </w:hyperlink>
+      <w:r>
+        <w:rPr>
+          <w:rFonts w:ascii="Arial" w:cs="Arial" w:eastAsia="Arial" w:hAnsi="Arial"/>
+        </w:rPr>
+        <w:t xml:space="preserve"> Click </w:t>
+      </w:r>
+      <w:r>
+        <w:rPr>
+          <w:rFonts w:ascii="Arial" w:cs="Arial" w:eastAsia="Arial" w:hAnsi="Arial"/>
+          <w:b/>
+          <w:bCs/>
+        </w:rPr>
+        <w:t xml:space="preserve">Link a billing account</w:t>
+      </w:r>
+      <w:r>
+        <w:rPr>
+          <w:rFonts w:ascii="Arial" w:cs="Arial" w:eastAsia="Arial" w:hAnsi="Arial"/>
+        </w:rPr>
+        <w:t xml:space="preserve"> (or </w:t>
+      </w:r>
+      <w:r>
+        <w:rPr>
+          <w:rFonts w:ascii="Arial" w:cs="Arial" w:eastAsia="Arial" w:hAnsi="Arial"/>
+          <w:b/>
+          <w:bCs/>
+        </w:rPr>
+        <w:t xml:space="preserve">Create account</w:t>
+      </w:r>
+      <w:r>
+        <w:rPr>
+          <w:rFonts w:ascii="Arial" w:cs="Arial" w:eastAsia="Arial" w:hAnsi="Arial"/>
+        </w:rPr>
+        <w:t xml:space="preserve">) and add your card. Without this, Google refuses the key.</w:t>
       </w:r>
     </w:p>
     <w:p>
@@ -1382,23 +1355,85 @@
       <w:r>
         <w:rPr>
           <w:rFonts w:ascii="Arial" w:cs="Arial" w:eastAsia="Arial" w:hAnsi="Arial"/>
-        </w:rPr>
-        <w:t xml:space="preserve">To change the area, the dates, etc., open the exercise's </w:t>
-      </w:r>
-      <w:r>
-        <w:rPr>
-          <w:rFonts w:ascii="Arial" w:cs="Arial" w:eastAsia="Arial" w:hAnsi="Arial"/>
-          <w:b/>
-          <w:bCs/>
-        </w:rPr>
-        <w:t xml:space="preserve">`settings.js`</w:t>
-      </w:r>
-      <w:r>
-        <w:rPr>
-          <w:rFonts w:ascii="Arial" w:cs="Arial" w:eastAsia="Arial" w:hAnsi="Arial"/>
-        </w:rPr>
-        <w:t xml:space="preserve">, change it, save, and run the steps again from step 1.</w:t>
-      </w:r>
+          <w:b/>
+          <w:bCs/>
+        </w:rPr>
+        <w:t xml:space="preserve">Switch on the two services</w:t>
+      </w:r>
+      <w:r>
+        <w:rPr>
+          <w:rFonts w:ascii="Arial" w:cs="Arial" w:eastAsia="Arial" w:hAnsi="Arial"/>
+        </w:rPr>
+        <w:t xml:space="preserve"> the exercises use. Open each link and click </w:t>
+      </w:r>
+      <w:r>
+        <w:rPr>
+          <w:rFonts w:ascii="Arial" w:cs="Arial" w:eastAsia="Arial" w:hAnsi="Arial"/>
+          <w:b/>
+          <w:bCs/>
+        </w:rPr>
+        <w:t xml:space="preserve">Enable</w:t>
+      </w:r>
+      <w:r>
+        <w:rPr>
+          <w:rFonts w:ascii="Arial" w:cs="Arial" w:eastAsia="Arial" w:hAnsi="Arial"/>
+        </w:rPr>
+        <w:t xml:space="preserve">: - </w:t>
+      </w:r>
+      <w:r>
+        <w:rPr>
+          <w:rFonts w:ascii="Arial" w:cs="Arial" w:eastAsia="Arial" w:hAnsi="Arial"/>
+          <w:b/>
+          <w:bCs/>
+        </w:rPr>
+        <w:t xml:space="preserve">Map Tiles API</w:t>
+      </w:r>
+      <w:r>
+        <w:rPr>
+          <w:rFonts w:ascii="Arial" w:cs="Arial" w:eastAsia="Arial" w:hAnsi="Arial"/>
+        </w:rPr>
+        <w:t xml:space="preserve"> (3D tiles, exercise 1): </w:t>
+      </w:r>
+      <w:hyperlink w:history="1" r:id="rIdhthw4l5bdr5i-e5uuuydl">
+        <w:r>
+          <w:rPr>
+            <w:rFonts w:ascii="Arial" w:cs="Arial" w:eastAsia="Arial" w:hAnsi="Arial"/>
+            <w:color w:val="0000FF"/>
+            <w:u w:val="single"/>
+          </w:rPr>
+          <w:t xml:space="preserve">https://console.cloud.google.com/apis/library/tile.googleapis.com</w:t>
+        </w:r>
+      </w:hyperlink>
+      <w:r>
+        <w:rPr>
+          <w:rFonts w:ascii="Arial" w:cs="Arial" w:eastAsia="Arial" w:hAnsi="Arial"/>
+        </w:rPr>
+        <w:t xml:space="preserve"> - </w:t>
+      </w:r>
+      <w:r>
+        <w:rPr>
+          <w:rFonts w:ascii="Arial" w:cs="Arial" w:eastAsia="Arial" w:hAnsi="Arial"/>
+          <w:b/>
+          <w:bCs/>
+        </w:rPr>
+        <w:t xml:space="preserve">Street View Static API</w:t>
+      </w:r>
+      <w:r>
+        <w:rPr>
+          <w:rFonts w:ascii="Arial" w:cs="Arial" w:eastAsia="Arial" w:hAnsi="Arial"/>
+        </w:rPr>
+        <w:t xml:space="preserve"> (exercise 2): </w:t>
+      </w:r>
+      <w:hyperlink w:history="1" r:id="rIdprygndrrblwub5rn95frs">
+        <w:r>
+          <w:rPr>
+            <w:rFonts w:ascii="Arial" w:cs="Arial" w:eastAsia="Arial" w:hAnsi="Arial"/>
+            <w:color w:val="0000FF"/>
+            <w:u w:val="single"/>
+          </w:rPr>
+          <w:t xml:space="preserve">https://console.cloud.google.com/apis/library/street-view-image-backend.googleapis.com</w:t>
+        </w:r>
+      </w:hyperlink>
     </w:p>
     <w:p>
       <w:pPr>
@@ -1406,6 +1441,1082 @@
         <w:numPr>
           <w:ilvl w:val="0"/>
           <w:numId w:val="5"/>
+        </w:numPr>
+      </w:pPr>
+      <w:r>
+        <w:rPr>
+          <w:rFonts w:ascii="Arial" w:cs="Arial" w:eastAsia="Arial" w:hAnsi="Arial"/>
+          <w:b/>
+          <w:bCs/>
+        </w:rPr>
+        <w:t xml:space="preserve">Make the key:</w:t>
+      </w:r>
+      <w:r>
+        <w:rPr>
+          <w:rFonts w:ascii="Arial" w:cs="Arial" w:eastAsia="Arial" w:hAnsi="Arial"/>
+        </w:rPr>
+        <w:t xml:space="preserve"> </w:t>
+      </w:r>
+      <w:hyperlink w:history="1" r:id="rId2byebszisbuvu4lhmlwvy">
+        <w:r>
+          <w:rPr>
+            <w:rFonts w:ascii="Arial" w:cs="Arial" w:eastAsia="Arial" w:hAnsi="Arial"/>
+            <w:color w:val="0000FF"/>
+            <w:u w:val="single"/>
+          </w:rPr>
+          <w:t xml:space="preserve">https://console.cloud.google.com/apis/credentials</w:t>
+        </w:r>
+      </w:hyperlink>
+      <w:r>
+        <w:rPr>
+          <w:rFonts w:ascii="Arial" w:cs="Arial" w:eastAsia="Arial" w:hAnsi="Arial"/>
+        </w:rPr>
+        <w:t xml:space="preserve"> Click </w:t>
+      </w:r>
+      <w:r>
+        <w:rPr>
+          <w:rFonts w:ascii="Arial" w:cs="Arial" w:eastAsia="Arial" w:hAnsi="Arial"/>
+          <w:b/>
+          <w:bCs/>
+        </w:rPr>
+        <w:t xml:space="preserve">+ Create credentials</w:t>
+      </w:r>
+      <w:r>
+        <w:rPr>
+          <w:rFonts w:ascii="Arial" w:cs="Arial" w:eastAsia="Arial" w:hAnsi="Arial"/>
+        </w:rPr>
+        <w:t xml:space="preserve"> → </w:t>
+      </w:r>
+      <w:r>
+        <w:rPr>
+          <w:rFonts w:ascii="Arial" w:cs="Arial" w:eastAsia="Arial" w:hAnsi="Arial"/>
+          <w:b/>
+          <w:bCs/>
+        </w:rPr>
+        <w:t xml:space="preserve">API key</w:t>
+      </w:r>
+      <w:r>
+        <w:rPr>
+          <w:rFonts w:ascii="Arial" w:cs="Arial" w:eastAsia="Arial" w:hAnsi="Arial"/>
+        </w:rPr>
+        <w:t xml:space="preserve">. Copy the key that appears (it starts with </w:t>
+      </w:r>
+      <w:r>
+        <w:rPr>
+          <w:rFonts w:ascii="Courier New" w:cs="Courier New" w:eastAsia="Courier New" w:hAnsi="Courier New"/>
+          <w:sz w:val="20"/>
+          <w:szCs w:val="20"/>
+        </w:rPr>
+        <w:t xml:space="preserve">AIza</w:t>
+      </w:r>
+      <w:r>
+        <w:rPr>
+          <w:rFonts w:ascii="Arial" w:cs="Arial" w:eastAsia="Arial" w:hAnsi="Arial"/>
+        </w:rPr>
+        <w:t xml:space="preserve">).</w:t>
+      </w:r>
+    </w:p>
+    <w:p>
+      <w:pPr>
+        <w:pStyle w:val="ListParagraph"/>
+        <w:numPr>
+          <w:ilvl w:val="0"/>
+          <w:numId w:val="5"/>
+        </w:numPr>
+      </w:pPr>
+      <w:r>
+        <w:rPr>
+          <w:rFonts w:ascii="Arial" w:cs="Arial" w:eastAsia="Arial" w:hAnsi="Arial"/>
+          <w:b/>
+          <w:bCs/>
+        </w:rPr>
+        <w:t xml:space="preserve">Protect it (recommended).</w:t>
+      </w:r>
+      <w:r>
+        <w:rPr>
+          <w:rFonts w:ascii="Arial" w:cs="Arial" w:eastAsia="Arial" w:hAnsi="Arial"/>
+        </w:rPr>
+        <w:t xml:space="preserve"> On the same page, click the key's name. Under </w:t>
+      </w:r>
+      <w:r>
+        <w:rPr>
+          <w:rFonts w:ascii="Arial" w:cs="Arial" w:eastAsia="Arial" w:hAnsi="Arial"/>
+          <w:b/>
+          <w:bCs/>
+        </w:rPr>
+        <w:t xml:space="preserve">API restrictions</w:t>
+      </w:r>
+      <w:r>
+        <w:rPr>
+          <w:rFonts w:ascii="Arial" w:cs="Arial" w:eastAsia="Arial" w:hAnsi="Arial"/>
+        </w:rPr>
+        <w:t xml:space="preserve"> choose </w:t>
+      </w:r>
+      <w:r>
+        <w:rPr>
+          <w:rFonts w:ascii="Arial" w:cs="Arial" w:eastAsia="Arial" w:hAnsi="Arial"/>
+          <w:b/>
+          <w:bCs/>
+        </w:rPr>
+        <w:t xml:space="preserve">Restrict key</w:t>
+      </w:r>
+      <w:r>
+        <w:rPr>
+          <w:rFonts w:ascii="Arial" w:cs="Arial" w:eastAsia="Arial" w:hAnsi="Arial"/>
+        </w:rPr>
+        <w:t xml:space="preserve">, tick </w:t>
+      </w:r>
+      <w:r>
+        <w:rPr>
+          <w:rFonts w:ascii="Arial" w:cs="Arial" w:eastAsia="Arial" w:hAnsi="Arial"/>
+          <w:b/>
+          <w:bCs/>
+        </w:rPr>
+        <w:t xml:space="preserve">Map Tiles API</w:t>
+      </w:r>
+      <w:r>
+        <w:rPr>
+          <w:rFonts w:ascii="Arial" w:cs="Arial" w:eastAsia="Arial" w:hAnsi="Arial"/>
+        </w:rPr>
+        <w:t xml:space="preserve"> and </w:t>
+      </w:r>
+      <w:r>
+        <w:rPr>
+          <w:rFonts w:ascii="Arial" w:cs="Arial" w:eastAsia="Arial" w:hAnsi="Arial"/>
+          <w:b/>
+          <w:bCs/>
+        </w:rPr>
+        <w:t xml:space="preserve">Street View Static API</w:t>
+      </w:r>
+      <w:r>
+        <w:rPr>
+          <w:rFonts w:ascii="Arial" w:cs="Arial" w:eastAsia="Arial" w:hAnsi="Arial"/>
+        </w:rPr>
+        <w:t xml:space="preserve">, and click </w:t>
+      </w:r>
+      <w:r>
+        <w:rPr>
+          <w:rFonts w:ascii="Arial" w:cs="Arial" w:eastAsia="Arial" w:hAnsi="Arial"/>
+          <w:b/>
+          <w:bCs/>
+        </w:rPr>
+        <w:t xml:space="preserve">Save</w:t>
+      </w:r>
+      <w:r>
+        <w:rPr>
+          <w:rFonts w:ascii="Arial" w:cs="Arial" w:eastAsia="Arial" w:hAnsi="Arial"/>
+        </w:rPr>
+        <w:t xml:space="preserve">. Leave "Application restrictions" on </w:t>
+      </w:r>
+      <w:r>
+        <w:rPr>
+          <w:rFonts w:ascii="Arial" w:cs="Arial" w:eastAsia="Arial" w:hAnsi="Arial"/>
+          <w:b/>
+          <w:bCs/>
+        </w:rPr>
+        <w:t xml:space="preserve">None</w:t>
+      </w:r>
+      <w:r>
+        <w:rPr>
+          <w:rFonts w:ascii="Arial" w:cs="Arial" w:eastAsia="Arial" w:hAnsi="Arial"/>
+        </w:rPr>
+        <w:t xml:space="preserve">, or the scripts stop working.</w:t>
+      </w:r>
+    </w:p>
+    <w:p>
+      <w:pPr>
+        <w:pStyle w:val="ListParagraph"/>
+        <w:numPr>
+          <w:ilvl w:val="0"/>
+          <w:numId w:val="5"/>
+        </w:numPr>
+      </w:pPr>
+      <w:r>
+        <w:rPr>
+          <w:rFonts w:ascii="Arial" w:cs="Arial" w:eastAsia="Arial" w:hAnsi="Arial"/>
+          <w:b/>
+          <w:bCs/>
+        </w:rPr>
+        <w:t xml:space="preserve">Set a budget alert (recommended),</w:t>
+      </w:r>
+      <w:r>
+        <w:rPr>
+          <w:rFonts w:ascii="Arial" w:cs="Arial" w:eastAsia="Arial" w:hAnsi="Arial"/>
+        </w:rPr>
+        <w:t xml:space="preserve"> so Google emails you before anything costs money: </w:t>
+      </w:r>
+      <w:hyperlink w:history="1" r:id="rIdbubhcbuele_rlk92oer0f">
+        <w:r>
+          <w:rPr>
+            <w:rFonts w:ascii="Arial" w:cs="Arial" w:eastAsia="Arial" w:hAnsi="Arial"/>
+            <w:color w:val="0000FF"/>
+            <w:u w:val="single"/>
+          </w:rPr>
+          <w:t xml:space="preserve">https://console.cloud.google.com/billing/budgets</w:t>
+        </w:r>
+      </w:hyperlink>
+      <w:r>
+        <w:rPr>
+          <w:rFonts w:ascii="Arial" w:cs="Arial" w:eastAsia="Arial" w:hAnsi="Arial"/>
+        </w:rPr>
+        <w:t xml:space="preserve"> → </w:t>
+      </w:r>
+      <w:r>
+        <w:rPr>
+          <w:rFonts w:ascii="Arial" w:cs="Arial" w:eastAsia="Arial" w:hAnsi="Arial"/>
+          <w:b/>
+          <w:bCs/>
+        </w:rPr>
+        <w:t xml:space="preserve">Create budget</w:t>
+      </w:r>
+      <w:r>
+        <w:rPr>
+          <w:rFonts w:ascii="Arial" w:cs="Arial" w:eastAsia="Arial" w:hAnsi="Arial"/>
+        </w:rPr>
+        <w:t xml:space="preserve">, e.g. 5 CHF, alerts at 50% and 100%.</w:t>
+      </w:r>
+    </w:p>
+    <w:p>
+      <w:pPr>
+        <w:pStyle w:val="ListParagraph"/>
+        <w:numPr>
+          <w:ilvl w:val="0"/>
+          <w:numId w:val="5"/>
+        </w:numPr>
+      </w:pPr>
+      <w:r>
+        <w:rPr>
+          <w:rFonts w:ascii="Arial" w:cs="Arial" w:eastAsia="Arial" w:hAnsi="Arial"/>
+        </w:rPr>
+        <w:t xml:space="preserve">Paste the key into </w:t>
+      </w:r>
+      <w:r>
+        <w:rPr>
+          <w:rFonts w:ascii="Courier New" w:cs="Courier New" w:eastAsia="Courier New" w:hAnsi="Courier New"/>
+          <w:sz w:val="20"/>
+          <w:szCs w:val="20"/>
+        </w:rPr>
+        <w:t xml:space="preserve">google-key.txt</w:t>
+      </w:r>
+      <w:r>
+        <w:rPr>
+          <w:rFonts w:ascii="Arial" w:cs="Arial" w:eastAsia="Arial" w:hAnsi="Arial"/>
+        </w:rPr>
+        <w:t xml:space="preserve"> (above), or into the key box of the web version.</w:t>
+      </w:r>
+    </w:p>
+    <w:p>
+      <w:r>
+        <w:rPr>
+          <w:rFonts w:ascii="Arial" w:cs="Arial" w:eastAsia="Arial" w:hAnsi="Arial"/>
+        </w:rPr>
+        <w:t xml:space="preserve">If you get </w:t>
+      </w:r>
+      <w:r>
+        <w:rPr>
+          <w:rFonts w:ascii="Courier New" w:cs="Courier New" w:eastAsia="Courier New" w:hAnsi="Courier New"/>
+          <w:sz w:val="20"/>
+          <w:szCs w:val="20"/>
+        </w:rPr>
+        <w:t xml:space="preserve">Google said 403</w:t>
+      </w:r>
+      <w:r>
+        <w:rPr>
+          <w:rFonts w:ascii="Arial" w:cs="Arial" w:eastAsia="Arial" w:hAnsi="Arial"/>
+        </w:rPr>
+        <w:t xml:space="preserve"> right after enabling the services, wait 5 minutes and try again: it takes Google a moment to switch them on.</w:t>
+      </w:r>
+    </w:p>
+    <w:p>
+      <w:r>
+        <w:rPr>
+          <w:rFonts w:ascii="Arial" w:cs="Arial" w:eastAsia="Arial" w:hAnsi="Arial"/>
+          <w:b/>
+          <w:bCs/>
+        </w:rPr>
+        <w:t xml:space="preserve">What it costs.</w:t>
+      </w:r>
+      <w:r>
+        <w:rPr>
+          <w:rFonts w:ascii="Arial" w:cs="Arial" w:eastAsia="Arial" w:hAnsi="Arial"/>
+        </w:rPr>
+        <w:t xml:space="preserve"> Google gives a free allowance every month (</w:t>
+      </w:r>
+      <w:hyperlink w:history="1" r:id="rId1s0dxdpk1jmo7gvhe4mhp">
+        <w:r>
+          <w:rPr>
+            <w:rFonts w:ascii="Arial" w:cs="Arial" w:eastAsia="Arial" w:hAnsi="Arial"/>
+            <w:color w:val="0000FF"/>
+            <w:u w:val="single"/>
+          </w:rPr>
+          <w:t xml:space="preserve">prices</w:t>
+        </w:r>
+      </w:hyperlink>
+      <w:r>
+        <w:rPr>
+          <w:rFonts w:ascii="Arial" w:cs="Arial" w:eastAsia="Arial" w:hAnsi="Arial"/>
+        </w:rPr>
+        <w:t xml:space="preserve">, checked September 2026):</w:t>
+      </w:r>
+    </w:p>
+    <w:tbl>
+      <w:tblPr>
+        <w:tblW w:type="dxa" w:w="9360"/>
+        <w:tblBorders>
+          <w:top w:val="single" w:color="auto" w:sz="4"/>
+          <w:left w:val="single" w:color="auto" w:sz="4"/>
+          <w:bottom w:val="single" w:color="auto" w:sz="4"/>
+          <w:right w:val="single" w:color="auto" w:sz="4"/>
+          <w:insideH w:val="single" w:color="auto" w:sz="4"/>
+          <w:insideV w:val="single" w:color="auto" w:sz="4"/>
+        </w:tblBorders>
+      </w:tblPr>
+      <w:tblGrid>
+        <w:gridCol w:w="2340"/>
+        <w:gridCol w:w="2340"/>
+        <w:gridCol w:w="2340"/>
+        <w:gridCol w:w="2340"/>
+      </w:tblGrid>
+      <w:tr>
+        <w:tc>
+          <w:tcPr>
+            <w:tcW w:type="dxa" w:w="2340"/>
+            <w:tcBorders>
+              <w:top w:val="single" w:color="000000" w:sz="4"/>
+              <w:left w:val="single" w:color="000000" w:sz="4"/>
+              <w:bottom w:val="single" w:color="000000" w:sz="4"/>
+              <w:right w:val="single" w:color="000000" w:sz="4"/>
+            </w:tcBorders>
+            <w:tcMar>
+              <w:top w:type="dxa" w:w="60"/>
+              <w:left w:type="dxa" w:w="100"/>
+              <w:bottom w:type="dxa" w:w="60"/>
+              <w:right w:type="dxa" w:w="100"/>
+            </w:tcMar>
+          </w:tcPr>
+          <w:p>
+            <w:r>
+              <w:rPr>
+                <w:rFonts w:ascii="Arial" w:cs="Arial" w:eastAsia="Arial" w:hAnsi="Arial"/>
+                <w:b/>
+                <w:bCs/>
+              </w:rPr>
+              <w:t xml:space="preserve">Exercise</w:t>
+            </w:r>
+          </w:p>
+        </w:tc>
+        <w:tc>
+          <w:tcPr>
+            <w:tcW w:type="dxa" w:w="2340"/>
+            <w:tcBorders>
+              <w:top w:val="single" w:color="000000" w:sz="4"/>
+              <w:left w:val="single" w:color="000000" w:sz="4"/>
+              <w:bottom w:val="single" w:color="000000" w:sz="4"/>
+              <w:right w:val="single" w:color="000000" w:sz="4"/>
+            </w:tcBorders>
+            <w:tcMar>
+              <w:top w:type="dxa" w:w="60"/>
+              <w:left w:type="dxa" w:w="100"/>
+              <w:bottom w:type="dxa" w:w="60"/>
+              <w:right w:type="dxa" w:w="100"/>
+            </w:tcMar>
+          </w:tcPr>
+          <w:p>
+            <w:r>
+              <w:rPr>
+                <w:rFonts w:ascii="Arial" w:cs="Arial" w:eastAsia="Arial" w:hAnsi="Arial"/>
+                <w:b/>
+                <w:bCs/>
+              </w:rPr>
+              <w:t xml:space="preserve">What counts</w:t>
+            </w:r>
+          </w:p>
+        </w:tc>
+        <w:tc>
+          <w:tcPr>
+            <w:tcW w:type="dxa" w:w="2340"/>
+            <w:tcBorders>
+              <w:top w:val="single" w:color="000000" w:sz="4"/>
+              <w:left w:val="single" w:color="000000" w:sz="4"/>
+              <w:bottom w:val="single" w:color="000000" w:sz="4"/>
+              <w:right w:val="single" w:color="000000" w:sz="4"/>
+            </w:tcBorders>
+            <w:tcMar>
+              <w:top w:type="dxa" w:w="60"/>
+              <w:left w:type="dxa" w:w="100"/>
+              <w:bottom w:type="dxa" w:w="60"/>
+              <w:right w:type="dxa" w:w="100"/>
+            </w:tcMar>
+          </w:tcPr>
+          <w:p>
+            <w:r>
+              <w:rPr>
+                <w:rFonts w:ascii="Arial" w:cs="Arial" w:eastAsia="Arial" w:hAnsi="Arial"/>
+                <w:b/>
+                <w:bCs/>
+              </w:rPr>
+              <w:t xml:space="preserve">Free each month</w:t>
+            </w:r>
+          </w:p>
+        </w:tc>
+        <w:tc>
+          <w:tcPr>
+            <w:tcW w:type="dxa" w:w="2340"/>
+            <w:tcBorders>
+              <w:top w:val="single" w:color="000000" w:sz="4"/>
+              <w:left w:val="single" w:color="000000" w:sz="4"/>
+              <w:bottom w:val="single" w:color="000000" w:sz="4"/>
+              <w:right w:val="single" w:color="000000" w:sz="4"/>
+            </w:tcBorders>
+            <w:tcMar>
+              <w:top w:type="dxa" w:w="60"/>
+              <w:left w:type="dxa" w:w="100"/>
+              <w:bottom w:type="dxa" w:w="60"/>
+              <w:right w:type="dxa" w:w="100"/>
+            </w:tcMar>
+          </w:tcPr>
+          <w:p>
+            <w:r>
+              <w:rPr>
+                <w:rFonts w:ascii="Arial" w:cs="Arial" w:eastAsia="Arial" w:hAnsi="Arial"/>
+                <w:b/>
+                <w:bCs/>
+              </w:rPr>
+              <w:t xml:space="preserve">After that</w:t>
+            </w:r>
+          </w:p>
+        </w:tc>
+      </w:tr>
+      <w:tr>
+        <w:tc>
+          <w:tcPr>
+            <w:tcW w:type="dxa" w:w="2340"/>
+            <w:tcBorders>
+              <w:top w:val="single" w:color="000000" w:sz="4"/>
+              <w:left w:val="single" w:color="000000" w:sz="4"/>
+              <w:bottom w:val="single" w:color="000000" w:sz="4"/>
+              <w:right w:val="single" w:color="000000" w:sz="4"/>
+            </w:tcBorders>
+            <w:tcMar>
+              <w:top w:type="dxa" w:w="60"/>
+              <w:left w:type="dxa" w:w="100"/>
+              <w:bottom w:type="dxa" w:w="60"/>
+              <w:right w:type="dxa" w:w="100"/>
+            </w:tcMar>
+          </w:tcPr>
+          <w:p>
+            <w:r>
+              <w:rPr>
+                <w:rFonts w:ascii="Arial" w:cs="Arial" w:eastAsia="Arial" w:hAnsi="Arial"/>
+              </w:rPr>
+              <w:t xml:space="preserve">1 · 3Dminus1</w:t>
+            </w:r>
+          </w:p>
+        </w:tc>
+        <w:tc>
+          <w:tcPr>
+            <w:tcW w:type="dxa" w:w="2340"/>
+            <w:tcBorders>
+              <w:top w:val="single" w:color="000000" w:sz="4"/>
+              <w:left w:val="single" w:color="000000" w:sz="4"/>
+              <w:bottom w:val="single" w:color="000000" w:sz="4"/>
+              <w:right w:val="single" w:color="000000" w:sz="4"/>
+            </w:tcBorders>
+            <w:tcMar>
+              <w:top w:type="dxa" w:w="60"/>
+              <w:left w:type="dxa" w:w="100"/>
+              <w:bottom w:type="dxa" w:w="60"/>
+              <w:right w:type="dxa" w:w="100"/>
+            </w:tcMar>
+          </w:tcPr>
+          <w:p>
+            <w:r>
+              <w:rPr>
+                <w:rFonts w:ascii="Arial" w:cs="Arial" w:eastAsia="Arial" w:hAnsi="Arial"/>
+              </w:rPr>
+              <w:t xml:space="preserve">one run of step 1 = 1 "Photorealistic 3D Tiles" session</w:t>
+            </w:r>
+          </w:p>
+        </w:tc>
+        <w:tc>
+          <w:tcPr>
+            <w:tcW w:type="dxa" w:w="2340"/>
+            <w:tcBorders>
+              <w:top w:val="single" w:color="000000" w:sz="4"/>
+              <w:left w:val="single" w:color="000000" w:sz="4"/>
+              <w:bottom w:val="single" w:color="000000" w:sz="4"/>
+              <w:right w:val="single" w:color="000000" w:sz="4"/>
+            </w:tcBorders>
+            <w:tcMar>
+              <w:top w:type="dxa" w:w="60"/>
+              <w:left w:type="dxa" w:w="100"/>
+              <w:bottom w:type="dxa" w:w="60"/>
+              <w:right w:type="dxa" w:w="100"/>
+            </w:tcMar>
+          </w:tcPr>
+          <w:p>
+            <w:r>
+              <w:rPr>
+                <w:rFonts w:ascii="Arial" w:cs="Arial" w:eastAsia="Arial" w:hAnsi="Arial"/>
+              </w:rPr>
+              <w:t xml:space="preserve">1,000</w:t>
+            </w:r>
+          </w:p>
+        </w:tc>
+        <w:tc>
+          <w:tcPr>
+            <w:tcW w:type="dxa" w:w="2340"/>
+            <w:tcBorders>
+              <w:top w:val="single" w:color="000000" w:sz="4"/>
+              <w:left w:val="single" w:color="000000" w:sz="4"/>
+              <w:bottom w:val="single" w:color="000000" w:sz="4"/>
+              <w:right w:val="single" w:color="000000" w:sz="4"/>
+            </w:tcBorders>
+            <w:tcMar>
+              <w:top w:type="dxa" w:w="60"/>
+              <w:left w:type="dxa" w:w="100"/>
+              <w:bottom w:type="dxa" w:w="60"/>
+              <w:right w:type="dxa" w:w="100"/>
+            </w:tcMar>
+          </w:tcPr>
+          <w:p>
+            <w:r>
+              <w:rPr>
+                <w:rFonts w:ascii="Arial" w:cs="Arial" w:eastAsia="Arial" w:hAnsi="Arial"/>
+              </w:rPr>
+              <w:t xml:space="preserve">$6 per 1,000</w:t>
+            </w:r>
+          </w:p>
+        </w:tc>
+      </w:tr>
+      <w:tr>
+        <w:tc>
+          <w:tcPr>
+            <w:tcW w:type="dxa" w:w="2340"/>
+            <w:tcBorders>
+              <w:top w:val="single" w:color="000000" w:sz="4"/>
+              <w:left w:val="single" w:color="000000" w:sz="4"/>
+              <w:bottom w:val="single" w:color="000000" w:sz="4"/>
+              <w:right w:val="single" w:color="000000" w:sz="4"/>
+            </w:tcBorders>
+            <w:tcMar>
+              <w:top w:type="dxa" w:w="60"/>
+              <w:left w:type="dxa" w:w="100"/>
+              <w:bottom w:type="dxa" w:w="60"/>
+              <w:right w:type="dxa" w:w="100"/>
+            </w:tcMar>
+          </w:tcPr>
+          <w:p>
+            <w:r>
+              <w:rPr>
+                <w:rFonts w:ascii="Arial" w:cs="Arial" w:eastAsia="Arial" w:hAnsi="Arial"/>
+              </w:rPr>
+              <w:t xml:space="preserve">2 · StreetTrack</w:t>
+            </w:r>
+          </w:p>
+        </w:tc>
+        <w:tc>
+          <w:tcPr>
+            <w:tcW w:type="dxa" w:w="2340"/>
+            <w:tcBorders>
+              <w:top w:val="single" w:color="000000" w:sz="4"/>
+              <w:left w:val="single" w:color="000000" w:sz="4"/>
+              <w:bottom w:val="single" w:color="000000" w:sz="4"/>
+              <w:right w:val="single" w:color="000000" w:sz="4"/>
+            </w:tcBorders>
+            <w:tcMar>
+              <w:top w:type="dxa" w:w="60"/>
+              <w:left w:type="dxa" w:w="100"/>
+              <w:bottom w:type="dxa" w:w="60"/>
+              <w:right w:type="dxa" w:w="100"/>
+            </w:tcMar>
+          </w:tcPr>
+          <w:p>
+            <w:r>
+              <w:rPr>
+                <w:rFonts w:ascii="Arial" w:cs="Arial" w:eastAsia="Arial" w:hAnsi="Arial"/>
+              </w:rPr>
+              <w:t xml:space="preserve">every photo downloaded (default area: about 970 per run)</w:t>
+            </w:r>
+          </w:p>
+        </w:tc>
+        <w:tc>
+          <w:tcPr>
+            <w:tcW w:type="dxa" w:w="2340"/>
+            <w:tcBorders>
+              <w:top w:val="single" w:color="000000" w:sz="4"/>
+              <w:left w:val="single" w:color="000000" w:sz="4"/>
+              <w:bottom w:val="single" w:color="000000" w:sz="4"/>
+              <w:right w:val="single" w:color="000000" w:sz="4"/>
+            </w:tcBorders>
+            <w:tcMar>
+              <w:top w:type="dxa" w:w="60"/>
+              <w:left w:type="dxa" w:w="100"/>
+              <w:bottom w:type="dxa" w:w="60"/>
+              <w:right w:type="dxa" w:w="100"/>
+            </w:tcMar>
+          </w:tcPr>
+          <w:p>
+            <w:r>
+              <w:rPr>
+                <w:rFonts w:ascii="Arial" w:cs="Arial" w:eastAsia="Arial" w:hAnsi="Arial"/>
+              </w:rPr>
+              <w:t xml:space="preserve">10,000 photos</w:t>
+            </w:r>
+          </w:p>
+        </w:tc>
+        <w:tc>
+          <w:tcPr>
+            <w:tcW w:type="dxa" w:w="2340"/>
+            <w:tcBorders>
+              <w:top w:val="single" w:color="000000" w:sz="4"/>
+              <w:left w:val="single" w:color="000000" w:sz="4"/>
+              <w:bottom w:val="single" w:color="000000" w:sz="4"/>
+              <w:right w:val="single" w:color="000000" w:sz="4"/>
+            </w:tcBorders>
+            <w:tcMar>
+              <w:top w:type="dxa" w:w="60"/>
+              <w:left w:type="dxa" w:w="100"/>
+              <w:bottom w:type="dxa" w:w="60"/>
+              <w:right w:type="dxa" w:w="100"/>
+            </w:tcMar>
+          </w:tcPr>
+          <w:p>
+            <w:r>
+              <w:rPr>
+                <w:rFonts w:ascii="Arial" w:cs="Arial" w:eastAsia="Arial" w:hAnsi="Arial"/>
+              </w:rPr>
+              <w:t xml:space="preserve">$7 per 1,000</w:t>
+            </w:r>
+          </w:p>
+        </w:tc>
+      </w:tr>
+      <w:tr>
+        <w:tc>
+          <w:tcPr>
+            <w:tcW w:type="dxa" w:w="2340"/>
+            <w:tcBorders>
+              <w:top w:val="single" w:color="000000" w:sz="4"/>
+              <w:left w:val="single" w:color="000000" w:sz="4"/>
+              <w:bottom w:val="single" w:color="000000" w:sz="4"/>
+              <w:right w:val="single" w:color="000000" w:sz="4"/>
+            </w:tcBorders>
+            <w:tcMar>
+              <w:top w:type="dxa" w:w="60"/>
+              <w:left w:type="dxa" w:w="100"/>
+              <w:bottom w:type="dxa" w:w="60"/>
+              <w:right w:type="dxa" w:w="100"/>
+            </w:tcMar>
+          </w:tcPr>
+          <w:p>
+            <w:r>
+              <w:rPr>
+                <w:rFonts w:ascii="Arial" w:cs="Arial" w:eastAsia="Arial" w:hAnsi="Arial"/>
+              </w:rPr>
+              <w:t xml:space="preserve">2 · StreetTrack, step 1</w:t>
+            </w:r>
+          </w:p>
+        </w:tc>
+        <w:tc>
+          <w:tcPr>
+            <w:tcW w:type="dxa" w:w="2340"/>
+            <w:tcBorders>
+              <w:top w:val="single" w:color="000000" w:sz="4"/>
+              <w:left w:val="single" w:color="000000" w:sz="4"/>
+              <w:bottom w:val="single" w:color="000000" w:sz="4"/>
+              <w:right w:val="single" w:color="000000" w:sz="4"/>
+            </w:tcBorders>
+            <w:tcMar>
+              <w:top w:type="dxa" w:w="60"/>
+              <w:left w:type="dxa" w:w="100"/>
+              <w:bottom w:type="dxa" w:w="60"/>
+              <w:right w:type="dxa" w:w="100"/>
+            </w:tcMar>
+          </w:tcPr>
+          <w:p>
+            <w:r>
+              <w:rPr>
+                <w:rFonts w:ascii="Arial" w:cs="Arial" w:eastAsia="Arial" w:hAnsi="Arial"/>
+              </w:rPr>
+              <w:t xml:space="preserve">looking up where the panoramas are</w:t>
+            </w:r>
+          </w:p>
+        </w:tc>
+        <w:tc>
+          <w:tcPr>
+            <w:tcW w:type="dxa" w:w="2340"/>
+            <w:tcBorders>
+              <w:top w:val="single" w:color="000000" w:sz="4"/>
+              <w:left w:val="single" w:color="000000" w:sz="4"/>
+              <w:bottom w:val="single" w:color="000000" w:sz="4"/>
+              <w:right w:val="single" w:color="000000" w:sz="4"/>
+            </w:tcBorders>
+            <w:tcMar>
+              <w:top w:type="dxa" w:w="60"/>
+              <w:left w:type="dxa" w:w="100"/>
+              <w:bottom w:type="dxa" w:w="60"/>
+              <w:right w:type="dxa" w:w="100"/>
+            </w:tcMar>
+          </w:tcPr>
+          <w:p>
+            <w:r>
+              <w:rPr>
+                <w:rFonts w:ascii="Arial" w:cs="Arial" w:eastAsia="Arial" w:hAnsi="Arial"/>
+              </w:rPr>
+              <w:t xml:space="preserve">unlimited</w:t>
+            </w:r>
+          </w:p>
+        </w:tc>
+        <w:tc>
+          <w:tcPr>
+            <w:tcW w:type="dxa" w:w="2340"/>
+            <w:tcBorders>
+              <w:top w:val="single" w:color="000000" w:sz="4"/>
+              <w:left w:val="single" w:color="000000" w:sz="4"/>
+              <w:bottom w:val="single" w:color="000000" w:sz="4"/>
+              <w:right w:val="single" w:color="000000" w:sz="4"/>
+            </w:tcBorders>
+            <w:tcMar>
+              <w:top w:type="dxa" w:w="60"/>
+              <w:left w:type="dxa" w:w="100"/>
+              <w:bottom w:type="dxa" w:w="60"/>
+              <w:right w:type="dxa" w:w="100"/>
+            </w:tcMar>
+          </w:tcPr>
+          <w:p>
+            <w:r>
+              <w:rPr>
+                <w:rFonts w:ascii="Arial" w:cs="Arial" w:eastAsia="Arial" w:hAnsi="Arial"/>
+              </w:rPr>
+              <w:t xml:space="preserve">free</w:t>
+            </w:r>
+          </w:p>
+        </w:tc>
+      </w:tr>
+    </w:tbl>
+    <w:p/>
+    <w:p>
+      <w:r>
+        <w:rPr>
+          <w:rFonts w:ascii="Arial" w:cs="Arial" w:eastAsia="Arial" w:hAnsi="Arial"/>
+        </w:rPr>
+        <w:t xml:space="preserve">So exercise 1 is practically free, and exercise 2 is free for about 10 full runs a month with the default area. Bigger areas or a smaller </w:t>
+      </w:r>
+      <w:r>
+        <w:rPr>
+          <w:rFonts w:ascii="Courier New" w:cs="Courier New" w:eastAsia="Courier New" w:hAnsi="Courier New"/>
+          <w:sz w:val="20"/>
+          <w:szCs w:val="20"/>
+        </w:rPr>
+        <w:t xml:space="preserve">SPACING</w:t>
+      </w:r>
+      <w:r>
+        <w:rPr>
+          <w:rFonts w:ascii="Arial" w:cs="Arial" w:eastAsia="Arial" w:hAnsi="Arial"/>
+        </w:rPr>
+        <w:t xml:space="preserve"> mean more photos.</w:t>
+      </w:r>
+    </w:p>
+    <w:p>
+      <w:r>
+        <w:rPr>
+          <w:rFonts w:ascii="Arial" w:cs="Arial" w:eastAsia="Arial" w:hAnsi="Arial"/>
+        </w:rPr>
+        <w:t xml:space="preserve">Official guides, if you get stuck: </w:t>
+      </w:r>
+      <w:hyperlink w:history="1" r:id="rIdzdcqyrzoj1i1fbh3frusr">
+        <w:r>
+          <w:rPr>
+            <w:rFonts w:ascii="Arial" w:cs="Arial" w:eastAsia="Arial" w:hAnsi="Arial"/>
+            <w:color w:val="0000FF"/>
+            <w:u w:val="single"/>
+          </w:rPr>
+          <w:t xml:space="preserve">key for the Map Tiles API</w:t>
+        </w:r>
+      </w:hyperlink>
+      <w:r>
+        <w:rPr>
+          <w:rFonts w:ascii="Arial" w:cs="Arial" w:eastAsia="Arial" w:hAnsi="Arial"/>
+        </w:rPr>
+        <w:t xml:space="preserve"> · </w:t>
+      </w:r>
+      <w:hyperlink w:history="1" r:id="rIdjqkwithaavt-q2sbla6a3">
+        <w:r>
+          <w:rPr>
+            <w:rFonts w:ascii="Arial" w:cs="Arial" w:eastAsia="Arial" w:hAnsi="Arial"/>
+            <w:color w:val="0000FF"/>
+            <w:u w:val="single"/>
+          </w:rPr>
+          <w:t xml:space="preserve">key for the Street View Static API</w:t>
+        </w:r>
+      </w:hyperlink>
+    </w:p>
+    <w:p>
+      <w:pPr>
+        <w:pStyle w:val="Heading1"/>
+      </w:pPr>
+      <w:r>
+        <w:rPr>
+          <w:rFonts w:ascii="Arial" w:cs="Arial" w:eastAsia="Arial" w:hAnsi="Arial"/>
+        </w:rPr>
+        <w:t xml:space="preserve">5. Run an exercise</w:t>
+      </w:r>
+    </w:p>
+    <w:p>
+      <w:r>
+        <w:rPr>
+          <w:rFonts w:ascii="Arial" w:cs="Arial" w:eastAsia="Arial" w:hAnsi="Arial"/>
+        </w:rPr>
+        <w:t xml:space="preserve">Every exercise works the same way. For example, exercise 1:</w:t>
+      </w:r>
+    </w:p>
+    <w:p>
+      <w:pPr>
+        <w:shd w:fill="F3F3F3" w:color="auto" w:val="clear"/>
+        <w:spacing w:after="0" w:before="80"/>
+        <w:ind w:left="200"/>
+      </w:pPr>
+      <w:r>
+        <w:rPr>
+          <w:rFonts w:ascii="Courier New" w:cs="Courier New" w:eastAsia="Courier New" w:hAnsi="Courier New"/>
+          <w:sz w:val="20"/>
+          <w:szCs w:val="20"/>
+        </w:rPr>
+        <w:t xml:space="preserve">cd 1-3Dminus1</w:t>
+      </w:r>
+    </w:p>
+    <w:p>
+      <w:pPr>
+        <w:shd w:fill="F3F3F3" w:color="auto" w:val="clear"/>
+        <w:spacing w:after="0" w:before="0"/>
+        <w:ind w:left="200"/>
+      </w:pPr>
+      <w:r>
+        <w:rPr>
+          <w:rFonts w:ascii="Courier New" w:cs="Courier New" w:eastAsia="Courier New" w:hAnsi="Courier New"/>
+          <w:sz w:val="20"/>
+          <w:szCs w:val="20"/>
+        </w:rPr>
+        <w:t xml:space="preserve">node 1-find-tiles.js</w:t>
+      </w:r>
+    </w:p>
+    <w:p>
+      <w:pPr>
+        <w:shd w:fill="F3F3F3" w:color="auto" w:val="clear"/>
+        <w:spacing w:after="0" w:before="0"/>
+        <w:ind w:left="200"/>
+      </w:pPr>
+      <w:r>
+        <w:rPr>
+          <w:rFonts w:ascii="Courier New" w:cs="Courier New" w:eastAsia="Courier New" w:hAnsi="Courier New"/>
+          <w:sz w:val="20"/>
+          <w:szCs w:val="20"/>
+        </w:rPr>
+        <w:t xml:space="preserve">node 2-get-textures.js</w:t>
+      </w:r>
+    </w:p>
+    <w:p>
+      <w:pPr>
+        <w:shd w:fill="F3F3F3" w:color="auto" w:val="clear"/>
+        <w:spacing w:after="0" w:before="0"/>
+        <w:ind w:left="200"/>
+      </w:pPr>
+      <w:r>
+        <w:rPr>
+          <w:rFonts w:ascii="Courier New" w:cs="Courier New" w:eastAsia="Courier New" w:hAnsi="Courier New"/>
+          <w:sz w:val="20"/>
+          <w:szCs w:val="20"/>
+        </w:rPr>
+        <w:t xml:space="preserve">node 3-make-map.js</w:t>
+      </w:r>
+    </w:p>
+    <w:p>
+      <w:pPr>
+        <w:shd w:fill="F3F3F3" w:color="auto" w:val="clear"/>
+        <w:spacing w:after="160" w:before="0"/>
+        <w:ind w:left="200"/>
+      </w:pPr>
+      <w:r>
+        <w:rPr>
+          <w:rFonts w:ascii="Courier New" w:cs="Courier New" w:eastAsia="Courier New" w:hAnsi="Courier New"/>
+          <w:sz w:val="20"/>
+          <w:szCs w:val="20"/>
+        </w:rPr>
+        <w:t xml:space="preserve">node 4-name-squares.js</w:t>
+      </w:r>
+    </w:p>
+    <w:p>
+      <w:pPr>
+        <w:pStyle w:val="ListParagraph"/>
+        <w:numPr>
+          <w:ilvl w:val="0"/>
+          <w:numId w:val="6"/>
+        </w:numPr>
+      </w:pPr>
+      <w:r>
+        <w:rPr>
+          <w:rFonts w:ascii="Courier New" w:cs="Courier New" w:eastAsia="Courier New" w:hAnsi="Courier New"/>
+          <w:sz w:val="20"/>
+          <w:szCs w:val="20"/>
+        </w:rPr>
+        <w:t xml:space="preserve">cd 1-3Dminus1</w:t>
+      </w:r>
+      <w:r>
+        <w:rPr>
+          <w:rFonts w:ascii="Arial" w:cs="Arial" w:eastAsia="Arial" w:hAnsi="Arial"/>
+        </w:rPr>
+        <w:t xml:space="preserve"> means "go into the folder 1-3Dminus1". Do it once, then run the steps.</w:t>
+      </w:r>
+    </w:p>
+    <w:p>
+      <w:pPr>
+        <w:pStyle w:val="ListParagraph"/>
+        <w:numPr>
+          <w:ilvl w:val="0"/>
+          <w:numId w:val="6"/>
+        </w:numPr>
+      </w:pPr>
+      <w:r>
+        <w:rPr>
+          <w:rFonts w:ascii="Arial" w:cs="Arial" w:eastAsia="Arial" w:hAnsi="Arial"/>
+        </w:rPr>
+        <w:t xml:space="preserve">Each </w:t>
+      </w:r>
+      <w:r>
+        <w:rPr>
+          <w:rFonts w:ascii="Courier New" w:cs="Courier New" w:eastAsia="Courier New" w:hAnsi="Courier New"/>
+          <w:sz w:val="20"/>
+          <w:szCs w:val="20"/>
+        </w:rPr>
+        <w:t xml:space="preserve">node …</w:t>
+      </w:r>
+      <w:r>
+        <w:rPr>
+          <w:rFonts w:ascii="Arial" w:cs="Arial" w:eastAsia="Arial" w:hAnsi="Arial"/>
+        </w:rPr>
+        <w:t xml:space="preserve"> line runs one step. Wait until it says </w:t>
+      </w:r>
+      <w:r>
+        <w:rPr>
+          <w:rFonts w:ascii="Arial" w:cs="Arial" w:eastAsia="Arial" w:hAnsi="Arial"/>
+          <w:b/>
+          <w:bCs/>
+        </w:rPr>
+        <w:t xml:space="preserve">Next: …</w:t>
+      </w:r>
+      <w:r>
+        <w:rPr>
+          <w:rFonts w:ascii="Arial" w:cs="Arial" w:eastAsia="Arial" w:hAnsi="Arial"/>
+        </w:rPr>
+        <w:t xml:space="preserve"> before running the next one.</w:t>
+      </w:r>
+    </w:p>
+    <w:p>
+      <w:pPr>
+        <w:pStyle w:val="ListParagraph"/>
+        <w:numPr>
+          <w:ilvl w:val="0"/>
+          <w:numId w:val="6"/>
+        </w:numPr>
+      </w:pPr>
+      <w:r>
+        <w:rPr>
+          <w:rFonts w:ascii="Arial" w:cs="Arial" w:eastAsia="Arial" w:hAnsi="Arial"/>
+        </w:rPr>
+        <w:t xml:space="preserve">Results appear in the exercise's </w:t>
+      </w:r>
+      <w:r>
+        <w:rPr>
+          <w:rFonts w:ascii="Arial" w:cs="Arial" w:eastAsia="Arial" w:hAnsi="Arial"/>
+          <w:b/>
+          <w:bCs/>
+        </w:rPr>
+        <w:t xml:space="preserve">`output`</w:t>
+      </w:r>
+      <w:r>
+        <w:rPr>
+          <w:rFonts w:ascii="Arial" w:cs="Arial" w:eastAsia="Arial" w:hAnsi="Arial"/>
+        </w:rPr>
+        <w:t xml:space="preserve"> folder, visible in VS Code's file list. Click an image to see it. For the video, the table (</w:t>
+      </w:r>
+      <w:r>
+        <w:rPr>
+          <w:rFonts w:ascii="Courier New" w:cs="Courier New" w:eastAsia="Courier New" w:hAnsi="Courier New"/>
+          <w:sz w:val="20"/>
+          <w:szCs w:val="20"/>
+        </w:rPr>
+        <w:t xml:space="preserve">.csv</w:t>
+      </w:r>
+      <w:r>
+        <w:rPr>
+          <w:rFonts w:ascii="Arial" w:cs="Arial" w:eastAsia="Arial" w:hAnsi="Arial"/>
+        </w:rPr>
+        <w:t xml:space="preserve">) or to see all images at once: right-click the file or folder → </w:t>
+      </w:r>
+      <w:r>
+        <w:rPr>
+          <w:rFonts w:ascii="Arial" w:cs="Arial" w:eastAsia="Arial" w:hAnsi="Arial"/>
+          <w:b/>
+          <w:bCs/>
+        </w:rPr>
+        <w:t xml:space="preserve">Reveal in Finder</w:t>
+      </w:r>
+      <w:r>
+        <w:rPr>
+          <w:rFonts w:ascii="Arial" w:cs="Arial" w:eastAsia="Arial" w:hAnsi="Arial"/>
+        </w:rPr>
+        <w:t xml:space="preserve"> (Mac) / </w:t>
+      </w:r>
+      <w:r>
+        <w:rPr>
+          <w:rFonts w:ascii="Arial" w:cs="Arial" w:eastAsia="Arial" w:hAnsi="Arial"/>
+          <w:b/>
+          <w:bCs/>
+        </w:rPr>
+        <w:t xml:space="preserve">Reveal in File Explorer</w:t>
+      </w:r>
+      <w:r>
+        <w:rPr>
+          <w:rFonts w:ascii="Arial" w:cs="Arial" w:eastAsia="Arial" w:hAnsi="Arial"/>
+        </w:rPr>
+        <w:t xml:space="preserve"> (Windows).</w:t>
+      </w:r>
+    </w:p>
+    <w:p>
+      <w:pPr>
+        <w:pStyle w:val="ListParagraph"/>
+        <w:numPr>
+          <w:ilvl w:val="0"/>
+          <w:numId w:val="6"/>
+        </w:numPr>
+      </w:pPr>
+      <w:r>
+        <w:rPr>
+          <w:rFonts w:ascii="Arial" w:cs="Arial" w:eastAsia="Arial" w:hAnsi="Arial"/>
+        </w:rPr>
+        <w:t xml:space="preserve">To change the area, the dates, etc., open the exercise's </w:t>
+      </w:r>
+      <w:r>
+        <w:rPr>
+          <w:rFonts w:ascii="Arial" w:cs="Arial" w:eastAsia="Arial" w:hAnsi="Arial"/>
+          <w:b/>
+          <w:bCs/>
+        </w:rPr>
+        <w:t xml:space="preserve">`settings.js`</w:t>
+      </w:r>
+      <w:r>
+        <w:rPr>
+          <w:rFonts w:ascii="Arial" w:cs="Arial" w:eastAsia="Arial" w:hAnsi="Arial"/>
+        </w:rPr>
+        <w:t xml:space="preserve">, change it, save, and run the steps again from step 1.</w:t>
+      </w:r>
+    </w:p>
+    <w:p>
+      <w:pPr>
+        <w:pStyle w:val="ListParagraph"/>
+        <w:numPr>
+          <w:ilvl w:val="0"/>
+          <w:numId w:val="6"/>
         </w:numPr>
       </w:pPr>
       <w:r>
@@ -2287,7 +3398,13 @@
               <w:rPr>
                 <w:rFonts w:ascii="Arial" w:cs="Arial" w:eastAsia="Arial" w:hAnsi="Arial"/>
               </w:rPr>
-              <w:t xml:space="preserve"> in the main folder (part 4)</w:t>
+              <w:t xml:space="preserve"> in the main folder (part 4), or </w:t>
+            </w:r>
+            <w:r>
+              <w:rPr>
+                <w:rFonts w:ascii="Arial" w:cs="Arial" w:eastAsia="Arial" w:hAnsi="Arial"/>
+              </w:rPr>
+              <w:t xml:space="preserve">make your own key</w:t>
             </w:r>
           </w:p>
         </w:tc>
@@ -2477,7 +3594,19 @@
               <w:rPr>
                 <w:rFonts w:ascii="Arial" w:cs="Arial" w:eastAsia="Arial" w:hAnsi="Arial"/>
               </w:rPr>
-              <w:t xml:space="preserve">the key isn't valid, or the needed Google API isn't enabled (ask your teacher)</w:t>
+              <w:t xml:space="preserve">the key isn't valid, billing isn't on, or the service isn't enabled: see </w:t>
+            </w:r>
+            <w:r>
+              <w:rPr>
+                <w:rFonts w:ascii="Arial" w:cs="Arial" w:eastAsia="Arial" w:hAnsi="Arial"/>
+              </w:rPr>
+              <w:t xml:space="preserve">Get your own Google key</w:t>
+            </w:r>
+            <w:r>
+              <w:rPr>
+                <w:rFonts w:ascii="Arial" w:cs="Arial" w:eastAsia="Arial" w:hAnsi="Arial"/>
+              </w:rPr>
+              <w:t xml:space="preserve">, steps 3 and 4 (after enabling, wait 5 minutes)</w:t>
             </w:r>
           </w:p>
         </w:tc>
@@ -2748,6 +3877,12 @@
     </w:lvlOverride>
   </w:num>
   <w:num w:numId="5">
+    <w:abstractNumId w:val="3"/>
+    <w:lvlOverride w:ilvl="0">
+      <w:startOverride w:val="1"/>
+    </w:lvlOverride>
+  </w:num>
+  <w:num w:numId="6">
     <w:abstractNumId w:val="2"/>
     <w:lvlOverride w:ilvl="0">
       <w:startOverride w:val="1"/>

</xml_diff>

<commit_message>
Rename to HS26_Internet-Architecture: update links and folder names
</commit_message>
<xml_diff>
--- a/docs/0 - Internet Architecture.docx
+++ b/docs/0 - Internet Architecture.docx
@@ -302,7 +302,7 @@
             </w:tcMar>
           </w:tcPr>
           <w:p>
-            <w:hyperlink w:history="1" r:id="rIdqgkuq0ri8yizxfjyuogpn">
+            <w:hyperlink w:history="1" r:id="rIdzn-bxjw6dgnb4sbcn-ijw">
               <w:r>
                 <w:rPr>
                   <w:rFonts w:ascii="Arial" w:cs="Arial" w:eastAsia="Arial" w:hAnsi="Arial"/>
@@ -449,7 +449,7 @@
             </w:tcMar>
           </w:tcPr>
           <w:p>
-            <w:hyperlink w:history="1" r:id="rId6yvvbrt9mzvsdohrguna8">
+            <w:hyperlink w:history="1" r:id="rIdxxfmbc8gdst-shq5jksie">
               <w:r>
                 <w:rPr>
                   <w:rFonts w:ascii="Arial" w:cs="Arial" w:eastAsia="Arial" w:hAnsi="Arial"/>
@@ -596,7 +596,7 @@
             </w:tcMar>
           </w:tcPr>
           <w:p>
-            <w:hyperlink w:history="1" r:id="rIdiquyhjem1xrj_6oq1ju99">
+            <w:hyperlink w:history="1" r:id="rIdgpn-raxu5s9lmenrdqgmr">
               <w:r>
                 <w:rPr>
                   <w:rFonts w:ascii="Arial" w:cs="Arial" w:eastAsia="Arial" w:hAnsi="Arial"/>
@@ -681,7 +681,7 @@
         </w:rPr>
         <w:t xml:space="preserve">, the editor where you'll do everything: </w:t>
       </w:r>
-      <w:hyperlink w:history="1" r:id="rIdn0w4s_qdbxrkfnmjwoyjr">
+      <w:hyperlink w:history="1" r:id="rIdw2a8kjp5yt59qh8gqdf3h">
         <w:r>
           <w:rPr>
             <w:rFonts w:ascii="Arial" w:cs="Arial" w:eastAsia="Arial" w:hAnsi="Arial"/>
@@ -714,7 +714,7 @@
         </w:rPr>
         <w:t xml:space="preserve">, which runs JavaScript files on your computer: </w:t>
       </w:r>
-      <w:hyperlink w:history="1" r:id="rIdlkh8kgsn7jyrstzotzli9">
+      <w:hyperlink w:history="1" r:id="rIdmpb9dpxhujsuzp9hpzycr">
         <w:r>
           <w:rPr>
             <w:rFonts w:ascii="Arial" w:cs="Arial" w:eastAsia="Arial" w:hAnsi="Arial"/>
@@ -867,7 +867,7 @@
           <w:sz w:val="20"/>
           <w:szCs w:val="20"/>
         </w:rPr>
-        <w:t xml:space="preserve">internet-architecture-main</w:t>
+        <w:t xml:space="preserve">HS26_Internet-Architecture-main</w:t>
       </w:r>
       <w:r>
         <w:rPr>
@@ -1193,7 +1193,7 @@
         </w:rPr>
         <w:t xml:space="preserve"> Go to </w:t>
       </w:r>
-      <w:hyperlink w:history="1" r:id="rIdj7yfx6gfqwdds3thdwm8t">
+      <w:hyperlink w:history="1" r:id="rIdkzklqvd7amipwew455dy9">
         <w:r>
           <w:rPr>
             <w:rFonts w:ascii="Arial" w:cs="Arial" w:eastAsia="Arial" w:hAnsi="Arial"/>
@@ -1232,7 +1232,7 @@
         </w:rPr>
         <w:t xml:space="preserve"> (a folder for your keys and settings): </w:t>
       </w:r>
-      <w:hyperlink w:history="1" r:id="rIdulxjrgym_q7niganrboty">
+      <w:hyperlink w:history="1" r:id="rIdqzsq-jjvu8elbsyl4ot9d">
         <w:r>
           <w:rPr>
             <w:rFonts w:ascii="Arial" w:cs="Arial" w:eastAsia="Arial" w:hAnsi="Arial"/>
@@ -1299,7 +1299,7 @@
         </w:rPr>
         <w:t xml:space="preserve"> </w:t>
       </w:r>
-      <w:hyperlink w:history="1" r:id="rIdfz-a92ku5g8hhpcfe42ue">
+      <w:hyperlink w:history="1" r:id="rIdocvhdsyuhg8fak7ce9i7e">
         <w:r>
           <w:rPr>
             <w:rFonts w:ascii="Arial" w:cs="Arial" w:eastAsia="Arial" w:hAnsi="Arial"/>
@@ -1394,7 +1394,7 @@
         </w:rPr>
         <w:t xml:space="preserve"> (3D tiles, exercise 1): </w:t>
       </w:r>
-      <w:hyperlink w:history="1" r:id="rIdhthw4l5bdr5i-e5uuuydl">
+      <w:hyperlink w:history="1" r:id="rIdpgihnx2zfjrhypk0fwma4">
         <w:r>
           <w:rPr>
             <w:rFonts w:ascii="Arial" w:cs="Arial" w:eastAsia="Arial" w:hAnsi="Arial"/>
@@ -1424,7 +1424,7 @@
         </w:rPr>
         <w:t xml:space="preserve"> (exercise 2): </w:t>
       </w:r>
-      <w:hyperlink w:history="1" r:id="rIdprygndrrblwub5rn95frs">
+      <w:hyperlink w:history="1" r:id="rIdptlq1y_xrqoyeh1ncyxl7">
         <w:r>
           <w:rPr>
             <w:rFonts w:ascii="Arial" w:cs="Arial" w:eastAsia="Arial" w:hAnsi="Arial"/>
@@ -1457,7 +1457,7 @@
         </w:rPr>
         <w:t xml:space="preserve"> </w:t>
       </w:r>
-      <w:hyperlink w:history="1" r:id="rId2byebszisbuvu4lhmlwvy">
+      <w:hyperlink w:history="1" r:id="rIdshclyr5rm8z5epd2sltxa">
         <w:r>
           <w:rPr>
             <w:rFonts w:ascii="Arial" w:cs="Arial" w:eastAsia="Arial" w:hAnsi="Arial"/>
@@ -1645,7 +1645,7 @@
         </w:rPr>
         <w:t xml:space="preserve"> so Google emails you before anything costs money: </w:t>
       </w:r>
-      <w:hyperlink w:history="1" r:id="rIdbubhcbuele_rlk92oer0f">
+      <w:hyperlink w:history="1" r:id="rIdxt1ge-31eodkfybuifry2">
         <w:r>
           <w:rPr>
             <w:rFonts w:ascii="Arial" w:cs="Arial" w:eastAsia="Arial" w:hAnsi="Arial"/>
@@ -1742,7 +1742,7 @@
         </w:rPr>
         <w:t xml:space="preserve"> Google gives a free allowance every month (</w:t>
       </w:r>
-      <w:hyperlink w:history="1" r:id="rId1s0dxdpk1jmo7gvhe4mhp">
+      <w:hyperlink w:history="1" r:id="rIdzmyp4m8iezohg1rtp5ywt">
         <w:r>
           <w:rPr>
             <w:rFonts w:ascii="Arial" w:cs="Arial" w:eastAsia="Arial" w:hAnsi="Arial"/>
@@ -2224,7 +2224,7 @@
         </w:rPr>
         <w:t xml:space="preserve">Official guides, if you get stuck: </w:t>
       </w:r>
-      <w:hyperlink w:history="1" r:id="rIdzdcqyrzoj1i1fbh3frusr">
+      <w:hyperlink w:history="1" r:id="rIdrk7ukfskosyvjj_sm_u5o">
         <w:r>
           <w:rPr>
             <w:rFonts w:ascii="Arial" w:cs="Arial" w:eastAsia="Arial" w:hAnsi="Arial"/>
@@ -2240,7 +2240,7 @@
         </w:rPr>
         <w:t xml:space="preserve"> · </w:t>
       </w:r>
-      <w:hyperlink w:history="1" r:id="rIdjqkwithaavt-q2sbla6a3">
+      <w:hyperlink w:history="1" r:id="rIdjjtskamlccnuvkpelgd8e">
         <w:r>
           <w:rPr>
             <w:rFonts w:ascii="Arial" w:cs="Arial" w:eastAsia="Arial" w:hAnsi="Arial"/>
@@ -2779,7 +2779,7 @@
           <w:b/>
           <w:bCs/>
         </w:rPr>
-        <w:t xml:space="preserve">https://luciarebolino.github.io/internet-architecture/web/</w:t>
+        <w:t xml:space="preserve">https://luciarebolino.github.io/HS26_Internet-Architecture/web/</w:t>
       </w:r>
       <w:r>
         <w:rPr>

</xml_diff>

<commit_message>
README: workshop introduction, key from Lucia
</commit_message>
<xml_diff>
--- a/docs/0 - Internet Architecture.docx
+++ b/docs/0 - Internet Architecture.docx
@@ -11,6 +11,22 @@
           <w:rFonts w:ascii="Arial" w:cs="Arial" w:eastAsia="Arial" w:hAnsi="Arial"/>
         </w:rPr>
         <w:t xml:space="preserve">Internet Architecture: three scraping exercises</w:t>
+      </w:r>
+    </w:p>
+    <w:p>
+      <w:r>
+        <w:rPr>
+          <w:rFonts w:ascii="Arial" w:cs="Arial" w:eastAsia="Arial" w:hAnsi="Arial"/>
+        </w:rPr>
+        <w:t xml:space="preserve">A workshop on the spatial practice of web scraping: automatically collecting and transforming digital material found online.</w:t>
+      </w:r>
+    </w:p>
+    <w:p>
+      <w:r>
+        <w:rPr>
+          <w:rFonts w:ascii="Arial" w:cs="Arial" w:eastAsia="Arial" w:hAnsi="Arial"/>
+        </w:rPr>
+        <w:t xml:space="preserve">We will learn how to scrape large quantities of material from the internet and reassemble them into an investigative narrative and visual essay that tell the story of a site. Using a counter-forensic lens, we will critically select a dataset and reverse-engineer how its images and spatial representations were produced. We will then curate the scraped images, videos and text into a contemporary digital form on narrative "internet architecture".</w:t>
       </w:r>
     </w:p>
     <w:p>
@@ -302,7 +318,7 @@
             </w:tcMar>
           </w:tcPr>
           <w:p>
-            <w:hyperlink w:history="1" r:id="rIdzn-bxjw6dgnb4sbcn-ijw">
+            <w:hyperlink w:history="1" r:id="rIdeqv2h-29zyuko828rvjyn">
               <w:r>
                 <w:rPr>
                   <w:rFonts w:ascii="Arial" w:cs="Arial" w:eastAsia="Arial" w:hAnsi="Arial"/>
@@ -449,7 +465,7 @@
             </w:tcMar>
           </w:tcPr>
           <w:p>
-            <w:hyperlink w:history="1" r:id="rIdxxfmbc8gdst-shq5jksie">
+            <w:hyperlink w:history="1" r:id="rIdjwblxqvzdy5oxxrwfr31c">
               <w:r>
                 <w:rPr>
                   <w:rFonts w:ascii="Arial" w:cs="Arial" w:eastAsia="Arial" w:hAnsi="Arial"/>
@@ -596,7 +612,7 @@
             </w:tcMar>
           </w:tcPr>
           <w:p>
-            <w:hyperlink w:history="1" r:id="rIdgpn-raxu5s9lmenrdqgmr">
+            <w:hyperlink w:history="1" r:id="rIdrgrkc1zfabhmjvvyld9d9">
               <w:r>
                 <w:rPr>
                   <w:rFonts w:ascii="Arial" w:cs="Arial" w:eastAsia="Arial" w:hAnsi="Arial"/>
@@ -681,7 +697,7 @@
         </w:rPr>
         <w:t xml:space="preserve">, the editor where you'll do everything: </w:t>
       </w:r>
-      <w:hyperlink w:history="1" r:id="rIdw2a8kjp5yt59qh8gqdf3h">
+      <w:hyperlink w:history="1" r:id="rIdlspk1gqf3pu1ojh4xe_zp">
         <w:r>
           <w:rPr>
             <w:rFonts w:ascii="Arial" w:cs="Arial" w:eastAsia="Arial" w:hAnsi="Arial"/>
@@ -714,7 +730,7 @@
         </w:rPr>
         <w:t xml:space="preserve">, which runs JavaScript files on your computer: </w:t>
       </w:r>
-      <w:hyperlink w:history="1" r:id="rIdmpb9dpxhujsuzp9hpzycr">
+      <w:hyperlink w:history="1" r:id="rIdnpfdt7trk-vifoytc46m-">
         <w:r>
           <w:rPr>
             <w:rFonts w:ascii="Arial" w:cs="Arial" w:eastAsia="Arial" w:hAnsi="Arial"/>
@@ -1014,7 +1030,7 @@
         <w:rPr>
           <w:rFonts w:ascii="Arial" w:cs="Arial" w:eastAsia="Arial" w:hAnsi="Arial"/>
         </w:rPr>
-        <w:t xml:space="preserve"> (a kind of password). Your teacher may give you one, or you can </w:t>
+        <w:t xml:space="preserve"> (a kind of password). Lucia may give you one, or you can </w:t>
       </w:r>
       <w:r>
         <w:rPr>
@@ -1026,7 +1042,7 @@
         <w:rPr>
           <w:rFonts w:ascii="Arial" w:cs="Arial" w:eastAsia="Arial" w:hAnsi="Arial"/>
         </w:rPr>
-        <w:t xml:space="preserve"> (about 15 minutes). Exercise 3 needs no key.</w:t>
+        <w:t xml:space="preserve"> (about 5 minutes). Exercise 3 needs no key.</w:t>
       </w:r>
     </w:p>
     <w:p>
@@ -1193,7 +1209,7 @@
         </w:rPr>
         <w:t xml:space="preserve"> Go to </w:t>
       </w:r>
-      <w:hyperlink w:history="1" r:id="rIdkzklqvd7amipwew455dy9">
+      <w:hyperlink w:history="1" r:id="rIdjynq8kpoj-1a_yhhergu0">
         <w:r>
           <w:rPr>
             <w:rFonts w:ascii="Arial" w:cs="Arial" w:eastAsia="Arial" w:hAnsi="Arial"/>
@@ -1232,7 +1248,7 @@
         </w:rPr>
         <w:t xml:space="preserve"> (a folder for your keys and settings): </w:t>
       </w:r>
-      <w:hyperlink w:history="1" r:id="rIdqzsq-jjvu8elbsyl4ot9d">
+      <w:hyperlink w:history="1" r:id="rIdzivkom76sx0-ljxtt4b-m">
         <w:r>
           <w:rPr>
             <w:rFonts w:ascii="Arial" w:cs="Arial" w:eastAsia="Arial" w:hAnsi="Arial"/>
@@ -1299,7 +1315,7 @@
         </w:rPr>
         <w:t xml:space="preserve"> </w:t>
       </w:r>
-      <w:hyperlink w:history="1" r:id="rIdocvhdsyuhg8fak7ce9i7e">
+      <w:hyperlink w:history="1" r:id="rIdg63643vstx0_eg_vcejnq">
         <w:r>
           <w:rPr>
             <w:rFonts w:ascii="Arial" w:cs="Arial" w:eastAsia="Arial" w:hAnsi="Arial"/>
@@ -1394,7 +1410,7 @@
         </w:rPr>
         <w:t xml:space="preserve"> (3D tiles, exercise 1): </w:t>
       </w:r>
-      <w:hyperlink w:history="1" r:id="rIdpgihnx2zfjrhypk0fwma4">
+      <w:hyperlink w:history="1" r:id="rId-q1yvxffw0xej9p7liwzd">
         <w:r>
           <w:rPr>
             <w:rFonts w:ascii="Arial" w:cs="Arial" w:eastAsia="Arial" w:hAnsi="Arial"/>
@@ -1424,7 +1440,7 @@
         </w:rPr>
         <w:t xml:space="preserve"> (exercise 2): </w:t>
       </w:r>
-      <w:hyperlink w:history="1" r:id="rIdptlq1y_xrqoyeh1ncyxl7">
+      <w:hyperlink w:history="1" r:id="rIdstnytyjewnkeqfjzeud3n">
         <w:r>
           <w:rPr>
             <w:rFonts w:ascii="Arial" w:cs="Arial" w:eastAsia="Arial" w:hAnsi="Arial"/>
@@ -1457,7 +1473,7 @@
         </w:rPr>
         <w:t xml:space="preserve"> </w:t>
       </w:r>
-      <w:hyperlink w:history="1" r:id="rIdshclyr5rm8z5epd2sltxa">
+      <w:hyperlink w:history="1" r:id="rIdhzswnz-feafecnodxypy3">
         <w:r>
           <w:rPr>
             <w:rFonts w:ascii="Arial" w:cs="Arial" w:eastAsia="Arial" w:hAnsi="Arial"/>
@@ -1645,7 +1661,7 @@
         </w:rPr>
         <w:t xml:space="preserve"> so Google emails you before anything costs money: </w:t>
       </w:r>
-      <w:hyperlink w:history="1" r:id="rIdxt1ge-31eodkfybuifry2">
+      <w:hyperlink w:history="1" r:id="rIdzauq1r7vt6ojtsf2xfqom">
         <w:r>
           <w:rPr>
             <w:rFonts w:ascii="Arial" w:cs="Arial" w:eastAsia="Arial" w:hAnsi="Arial"/>
@@ -1742,7 +1758,7 @@
         </w:rPr>
         <w:t xml:space="preserve"> Google gives a free allowance every month (</w:t>
       </w:r>
-      <w:hyperlink w:history="1" r:id="rIdzmyp4m8iezohg1rtp5ywt">
+      <w:hyperlink w:history="1" r:id="rIdvgpwzmfde_hqi2p9geebo">
         <w:r>
           <w:rPr>
             <w:rFonts w:ascii="Arial" w:cs="Arial" w:eastAsia="Arial" w:hAnsi="Arial"/>
@@ -2224,7 +2240,7 @@
         </w:rPr>
         <w:t xml:space="preserve">Official guides, if you get stuck: </w:t>
       </w:r>
-      <w:hyperlink w:history="1" r:id="rIdrk7ukfskosyvjj_sm_u5o">
+      <w:hyperlink w:history="1" r:id="rIdlevi-njj5rkf0hydfq6tl">
         <w:r>
           <w:rPr>
             <w:rFonts w:ascii="Arial" w:cs="Arial" w:eastAsia="Arial" w:hAnsi="Arial"/>
@@ -2240,7 +2256,7 @@
         </w:rPr>
         <w:t xml:space="preserve"> · </w:t>
       </w:r>
-      <w:hyperlink w:history="1" r:id="rIdjjtskamlccnuvkpelgd8e">
+      <w:hyperlink w:history="1" r:id="rId3fmcparxoohhnr5vpwsnp">
         <w:r>
           <w:rPr>
             <w:rFonts w:ascii="Arial" w:cs="Arial" w:eastAsia="Arial" w:hAnsi="Arial"/>

</xml_diff>

<commit_message>
Are.na Board: a shared board for any Are.na channel
</commit_message>
<xml_diff>
--- a/docs/0 - Internet Architecture.docx
+++ b/docs/0 - Internet Architecture.docx
@@ -318,7 +318,7 @@
             </w:tcMar>
           </w:tcPr>
           <w:p>
-            <w:hyperlink w:history="1" r:id="rIdjqcdbmb6_liu5po8znl8l">
+            <w:hyperlink w:history="1" r:id="rIdwt0oxbe5-1erk5n4g9bte">
               <w:r>
                 <w:rPr>
                   <w:rFonts w:ascii="Arial" w:cs="Arial" w:eastAsia="Arial" w:hAnsi="Arial"/>
@@ -465,7 +465,7 @@
             </w:tcMar>
           </w:tcPr>
           <w:p>
-            <w:hyperlink w:history="1" r:id="rIdklrns31tvlilddius1zmc">
+            <w:hyperlink w:history="1" r:id="rIdnbyb7kh9sawpp8n88kj_b">
               <w:r>
                 <w:rPr>
                   <w:rFonts w:ascii="Arial" w:cs="Arial" w:eastAsia="Arial" w:hAnsi="Arial"/>
@@ -612,7 +612,7 @@
             </w:tcMar>
           </w:tcPr>
           <w:p>
-            <w:hyperlink w:history="1" r:id="rIdrnrq7tkzarhoe7buwpfvq">
+            <w:hyperlink w:history="1" r:id="rId11zffk_ydaaah6e8o0krr">
               <w:r>
                 <w:rPr>
                   <w:rFonts w:ascii="Arial" w:cs="Arial" w:eastAsia="Arial" w:hAnsi="Arial"/>
@@ -646,6 +646,38 @@
         <w:rPr>
           <w:rFonts w:ascii="Arial" w:cs="Arial" w:eastAsia="Arial" w:hAnsi="Arial"/>
         </w:rPr>
+        <w:t xml:space="preserve">To collect and rearrange what you find, there is also a shared </w:t>
+      </w:r>
+      <w:r>
+        <w:rPr>
+          <w:rFonts w:ascii="Arial" w:cs="Arial" w:eastAsia="Arial" w:hAnsi="Arial"/>
+          <w:b/>
+          <w:bCs/>
+        </w:rPr>
+        <w:t xml:space="preserve">[Are.na Board](board/)</w:t>
+      </w:r>
+      <w:r>
+        <w:rPr>
+          <w:rFonts w:ascii="Arial" w:cs="Arial" w:eastAsia="Arial" w:hAnsi="Arial"/>
+        </w:rPr>
+        <w:t xml:space="preserve">: paste your Are.na channel's link, and everyone in your group can rearrange its blocks together, live, at </w:t>
+      </w:r>
+      <w:hyperlink w:history="1" r:id="rIds7hbu9we838bkalx7vwnx">
+        <w:r>
+          <w:rPr>
+            <w:rFonts w:ascii="Arial" w:cs="Arial" w:eastAsia="Arial" w:hAnsi="Arial"/>
+            <w:color w:val="0000FF"/>
+            <w:u w:val="single"/>
+          </w:rPr>
+          <w:t xml:space="preserve">https://luciarebolino.github.io/HS26_Internet-Architecture/board/</w:t>
+        </w:r>
+      </w:hyperlink>
+    </w:p>
+    <w:p>
+      <w:r>
+        <w:rPr>
+          <w:rFonts w:ascii="Arial" w:cs="Arial" w:eastAsia="Arial" w:hAnsi="Arial"/>
+        </w:rPr>
         <w:t xml:space="preserve">You don't need to know how to code. Each exercise is a short series of steps: you type one command in the terminal, it does one thing, saves the result in a folder and tells you what to do next.</w:t>
       </w:r>
     </w:p>
@@ -697,7 +729,7 @@
         </w:rPr>
         <w:t xml:space="preserve">, the editor where you'll do everything: </w:t>
       </w:r>
-      <w:hyperlink w:history="1" r:id="rId4jkprgec0fmmhcihapxop">
+      <w:hyperlink w:history="1" r:id="rIdkgsijz5tynke9yzw0l4np">
         <w:r>
           <w:rPr>
             <w:rFonts w:ascii="Arial" w:cs="Arial" w:eastAsia="Arial" w:hAnsi="Arial"/>
@@ -730,7 +762,7 @@
         </w:rPr>
         <w:t xml:space="preserve">, which runs JavaScript files on your computer: </w:t>
       </w:r>
-      <w:hyperlink w:history="1" r:id="rIdmv1q5ppbri0ze8bdqpz3b">
+      <w:hyperlink w:history="1" r:id="rIda58rfg6eetnkkgoitthyt">
         <w:r>
           <w:rPr>
             <w:rFonts w:ascii="Arial" w:cs="Arial" w:eastAsia="Arial" w:hAnsi="Arial"/>
@@ -1209,7 +1241,7 @@
         </w:rPr>
         <w:t xml:space="preserve"> Go to </w:t>
       </w:r>
-      <w:hyperlink w:history="1" r:id="rIdmem2e0fufwlccavxlenxc">
+      <w:hyperlink w:history="1" r:id="rIdixbnycj2-pkxvotgjdfja">
         <w:r>
           <w:rPr>
             <w:rFonts w:ascii="Arial" w:cs="Arial" w:eastAsia="Arial" w:hAnsi="Arial"/>
@@ -1248,7 +1280,7 @@
         </w:rPr>
         <w:t xml:space="preserve"> (a folder for your keys and settings): </w:t>
       </w:r>
-      <w:hyperlink w:history="1" r:id="rIddbiqooe-0bbln8ofvmqow">
+      <w:hyperlink w:history="1" r:id="rId_fiqakx2vfciutnyex1ph">
         <w:r>
           <w:rPr>
             <w:rFonts w:ascii="Arial" w:cs="Arial" w:eastAsia="Arial" w:hAnsi="Arial"/>
@@ -1315,7 +1347,7 @@
         </w:rPr>
         <w:t xml:space="preserve"> </w:t>
       </w:r>
-      <w:hyperlink w:history="1" r:id="rIdpkcvw6ba_cs0otvyodyxh">
+      <w:hyperlink w:history="1" r:id="rId5pssu55condeq58h_qa-l">
         <w:r>
           <w:rPr>
             <w:rFonts w:ascii="Arial" w:cs="Arial" w:eastAsia="Arial" w:hAnsi="Arial"/>
@@ -1410,7 +1442,7 @@
         </w:rPr>
         <w:t xml:space="preserve"> (3D tiles, exercise 1): </w:t>
       </w:r>
-      <w:hyperlink w:history="1" r:id="rIdgfq2l7jq574chbunhhckl">
+      <w:hyperlink w:history="1" r:id="rIdrnqnzsmlskxpsps_pcoep">
         <w:r>
           <w:rPr>
             <w:rFonts w:ascii="Arial" w:cs="Arial" w:eastAsia="Arial" w:hAnsi="Arial"/>
@@ -1440,7 +1472,7 @@
         </w:rPr>
         <w:t xml:space="preserve"> (exercise 2): </w:t>
       </w:r>
-      <w:hyperlink w:history="1" r:id="rIdd33pizy5r5zkpconrsq0d">
+      <w:hyperlink w:history="1" r:id="rId4vbec1gsqiagzh7iyrd13">
         <w:r>
           <w:rPr>
             <w:rFonts w:ascii="Arial" w:cs="Arial" w:eastAsia="Arial" w:hAnsi="Arial"/>
@@ -1473,7 +1505,7 @@
         </w:rPr>
         <w:t xml:space="preserve"> </w:t>
       </w:r>
-      <w:hyperlink w:history="1" r:id="rIdzro0gh3amp_o02luvuuar">
+      <w:hyperlink w:history="1" r:id="rIdnm7s2yyd7z4pzk-v4rbwt">
         <w:r>
           <w:rPr>
             <w:rFonts w:ascii="Arial" w:cs="Arial" w:eastAsia="Arial" w:hAnsi="Arial"/>
@@ -1661,7 +1693,7 @@
         </w:rPr>
         <w:t xml:space="preserve"> so Google emails you before anything costs money: </w:t>
       </w:r>
-      <w:hyperlink w:history="1" r:id="rIdppob5fnbjy-9oykysn5oy">
+      <w:hyperlink w:history="1" r:id="rIdqk5xs6mky0nm41y2mvupe">
         <w:r>
           <w:rPr>
             <w:rFonts w:ascii="Arial" w:cs="Arial" w:eastAsia="Arial" w:hAnsi="Arial"/>
@@ -1758,7 +1790,7 @@
         </w:rPr>
         <w:t xml:space="preserve"> Google gives a free allowance every month (</w:t>
       </w:r>
-      <w:hyperlink w:history="1" r:id="rId8xnmmn5xa9j9romhmsbpo">
+      <w:hyperlink w:history="1" r:id="rIdtfzvoz9hl63y9aysa_cxp">
         <w:r>
           <w:rPr>
             <w:rFonts w:ascii="Arial" w:cs="Arial" w:eastAsia="Arial" w:hAnsi="Arial"/>
@@ -2240,7 +2272,7 @@
         </w:rPr>
         <w:t xml:space="preserve">Official guides, if you get stuck: </w:t>
       </w:r>
-      <w:hyperlink w:history="1" r:id="rIdeyshkoya2zwxtmkgyf5r8">
+      <w:hyperlink w:history="1" r:id="rId-boqezz24ceblx3mvt3zb">
         <w:r>
           <w:rPr>
             <w:rFonts w:ascii="Arial" w:cs="Arial" w:eastAsia="Arial" w:hAnsi="Arial"/>
@@ -2256,7 +2288,7 @@
         </w:rPr>
         <w:t xml:space="preserve"> · </w:t>
       </w:r>
-      <w:hyperlink w:history="1" r:id="rIdavkctpoy-sscvltyqhvx2">
+      <w:hyperlink w:history="1" r:id="rIdtfa4ki34kfga8eb1h9dyd">
         <w:r>
           <w:rPr>
             <w:rFonts w:ascii="Arial" w:cs="Arial" w:eastAsia="Arial" w:hAnsi="Arial"/>
@@ -3691,7 +3723,7 @@
           <w:numId w:val="6"/>
         </w:numPr>
       </w:pPr>
-      <w:hyperlink w:history="1" r:id="rIdac7cvsy44r23zw6ztd4kp">
+      <w:hyperlink w:history="1" r:id="rIdshvmcom2ufw10obf8foki">
         <w:r>
           <w:rPr>
             <w:rFonts w:ascii="Arial" w:cs="Arial" w:eastAsia="Arial" w:hAnsi="Arial"/>
@@ -3710,7 +3742,7 @@
           <w:numId w:val="6"/>
         </w:numPr>
       </w:pPr>
-      <w:hyperlink w:history="1" r:id="rIdehofuotrbdttkw00b4s6r">
+      <w:hyperlink w:history="1" r:id="rIdtbr3ebu2fynljj98jwhdn">
         <w:r>
           <w:rPr>
             <w:rFonts w:ascii="Arial" w:cs="Arial" w:eastAsia="Arial" w:hAnsi="Arial"/>
@@ -3729,7 +3761,7 @@
           <w:numId w:val="6"/>
         </w:numPr>
       </w:pPr>
-      <w:hyperlink w:history="1" r:id="rId6wdse820izqaafyjcszhq">
+      <w:hyperlink w:history="1" r:id="rIdhguohihiacmhif3i9lxcm">
         <w:r>
           <w:rPr>
             <w:rFonts w:ascii="Arial" w:cs="Arial" w:eastAsia="Arial" w:hAnsi="Arial"/>
@@ -3748,7 +3780,7 @@
           <w:numId w:val="6"/>
         </w:numPr>
       </w:pPr>
-      <w:hyperlink w:history="1" r:id="rId3gl-kjsf-letx0bstkzdq">
+      <w:hyperlink w:history="1" r:id="rId7i9w6qqn_0otombmr_xtc">
         <w:r>
           <w:rPr>
             <w:rFonts w:ascii="Arial" w:cs="Arial" w:eastAsia="Arial" w:hAnsi="Arial"/>
@@ -3767,7 +3799,7 @@
           <w:numId w:val="6"/>
         </w:numPr>
       </w:pPr>
-      <w:hyperlink w:history="1" r:id="rIdfzgbizhtnggy9ryvahvoy">
+      <w:hyperlink w:history="1" r:id="rIdafugg7rg65b_tpqfx1ic_">
         <w:r>
           <w:rPr>
             <w:rFonts w:ascii="Arial" w:cs="Arial" w:eastAsia="Arial" w:hAnsi="Arial"/>
@@ -3786,7 +3818,7 @@
           <w:numId w:val="6"/>
         </w:numPr>
       </w:pPr>
-      <w:hyperlink w:history="1" r:id="rIdib3whtyvxpumyjfm6c8-c">
+      <w:hyperlink w:history="1" r:id="rIdzwhrgylqmqkjl16hvwr_b">
         <w:r>
           <w:rPr>
             <w:rFonts w:ascii="Arial" w:cs="Arial" w:eastAsia="Arial" w:hAnsi="Arial"/>
@@ -3805,7 +3837,7 @@
           <w:numId w:val="6"/>
         </w:numPr>
       </w:pPr>
-      <w:hyperlink w:history="1" r:id="rIdfmo0kzrqtryno7m7m4id4">
+      <w:hyperlink w:history="1" r:id="rId-mx2nskhvgawbcpy9ppga">
         <w:r>
           <w:rPr>
             <w:rFonts w:ascii="Arial" w:cs="Arial" w:eastAsia="Arial" w:hAnsi="Arial"/>
@@ -3824,7 +3856,7 @@
           <w:numId w:val="6"/>
         </w:numPr>
       </w:pPr>
-      <w:hyperlink w:history="1" r:id="rId1keysnhvrgrmipa6zbe7d">
+      <w:hyperlink w:history="1" r:id="rId0sbz4ocwp1yolfduuzzdu">
         <w:r>
           <w:rPr>
             <w:rFonts w:ascii="Arial" w:cs="Arial" w:eastAsia="Arial" w:hAnsi="Arial"/>
@@ -3843,7 +3875,7 @@
           <w:numId w:val="6"/>
         </w:numPr>
       </w:pPr>
-      <w:hyperlink w:history="1" r:id="rIddfe1gyqn0l5cer8psh_wb">
+      <w:hyperlink w:history="1" r:id="rIdvvxyjeembwjpr1hgg1tod">
         <w:r>
           <w:rPr>
             <w:rFonts w:ascii="Arial" w:cs="Arial" w:eastAsia="Arial" w:hAnsi="Arial"/>
@@ -3862,7 +3894,7 @@
           <w:numId w:val="6"/>
         </w:numPr>
       </w:pPr>
-      <w:hyperlink w:history="1" r:id="rIdojnf-uwy9su7_oiq_mdoa">
+      <w:hyperlink w:history="1" r:id="rId7xn2jsgnrtwnpmc7sweqa">
         <w:r>
           <w:rPr>
             <w:rFonts w:ascii="Arial" w:cs="Arial" w:eastAsia="Arial" w:hAnsi="Arial"/>
@@ -3881,7 +3913,7 @@
           <w:numId w:val="6"/>
         </w:numPr>
       </w:pPr>
-      <w:hyperlink w:history="1" r:id="rIda1h4l8gfvvjmomdx0okbt">
+      <w:hyperlink w:history="1" r:id="rIdrv50zhc38v2qolk9dojh7">
         <w:r>
           <w:rPr>
             <w:rFonts w:ascii="Arial" w:cs="Arial" w:eastAsia="Arial" w:hAnsi="Arial"/>
@@ -3900,7 +3932,7 @@
           <w:numId w:val="6"/>
         </w:numPr>
       </w:pPr>
-      <w:hyperlink w:history="1" r:id="rId4npkitdegok0hpkw8hiwl">
+      <w:hyperlink w:history="1" r:id="rId6tf8i7xsdfi_nqr_fnvrb">
         <w:r>
           <w:rPr>
             <w:rFonts w:ascii="Arial" w:cs="Arial" w:eastAsia="Arial" w:hAnsi="Arial"/>
@@ -3919,7 +3951,7 @@
           <w:numId w:val="6"/>
         </w:numPr>
       </w:pPr>
-      <w:hyperlink w:history="1" r:id="rIdtfvfb_lxpq_3skk6eyxwi">
+      <w:hyperlink w:history="1" r:id="rIdcpcuitsqtnw4yhl0aitdg">
         <w:r>
           <w:rPr>
             <w:rFonts w:ascii="Arial" w:cs="Arial" w:eastAsia="Arial" w:hAnsi="Arial"/>

</xml_diff>

<commit_message>
Remove the Are.na Board for now
</commit_message>
<xml_diff>
--- a/docs/0 - Internet Architecture.docx
+++ b/docs/0 - Internet Architecture.docx
@@ -318,7 +318,7 @@
             </w:tcMar>
           </w:tcPr>
           <w:p>
-            <w:hyperlink w:history="1" r:id="rIdwt0oxbe5-1erk5n4g9bte">
+            <w:hyperlink w:history="1" r:id="rId71c-ahi4iszuxarwfe5qa">
               <w:r>
                 <w:rPr>
                   <w:rFonts w:ascii="Arial" w:cs="Arial" w:eastAsia="Arial" w:hAnsi="Arial"/>
@@ -465,7 +465,7 @@
             </w:tcMar>
           </w:tcPr>
           <w:p>
-            <w:hyperlink w:history="1" r:id="rIdnbyb7kh9sawpp8n88kj_b">
+            <w:hyperlink w:history="1" r:id="rId4jkkto627tb1bqlkqzsql">
               <w:r>
                 <w:rPr>
                   <w:rFonts w:ascii="Arial" w:cs="Arial" w:eastAsia="Arial" w:hAnsi="Arial"/>
@@ -612,7 +612,7 @@
             </w:tcMar>
           </w:tcPr>
           <w:p>
-            <w:hyperlink w:history="1" r:id="rId11zffk_ydaaah6e8o0krr">
+            <w:hyperlink w:history="1" r:id="rId8-awc8adcctdve63tm0z_">
               <w:r>
                 <w:rPr>
                   <w:rFonts w:ascii="Arial" w:cs="Arial" w:eastAsia="Arial" w:hAnsi="Arial"/>
@@ -646,38 +646,6 @@
         <w:rPr>
           <w:rFonts w:ascii="Arial" w:cs="Arial" w:eastAsia="Arial" w:hAnsi="Arial"/>
         </w:rPr>
-        <w:t xml:space="preserve">To collect and rearrange what you find, there is also a shared </w:t>
-      </w:r>
-      <w:r>
-        <w:rPr>
-          <w:rFonts w:ascii="Arial" w:cs="Arial" w:eastAsia="Arial" w:hAnsi="Arial"/>
-          <w:b/>
-          <w:bCs/>
-        </w:rPr>
-        <w:t xml:space="preserve">[Are.na Board](board/)</w:t>
-      </w:r>
-      <w:r>
-        <w:rPr>
-          <w:rFonts w:ascii="Arial" w:cs="Arial" w:eastAsia="Arial" w:hAnsi="Arial"/>
-        </w:rPr>
-        <w:t xml:space="preserve">: paste your Are.na channel's link, and everyone in your group can rearrange its blocks together, live, at </w:t>
-      </w:r>
-      <w:hyperlink w:history="1" r:id="rIds7hbu9we838bkalx7vwnx">
-        <w:r>
-          <w:rPr>
-            <w:rFonts w:ascii="Arial" w:cs="Arial" w:eastAsia="Arial" w:hAnsi="Arial"/>
-            <w:color w:val="0000FF"/>
-            <w:u w:val="single"/>
-          </w:rPr>
-          <w:t xml:space="preserve">https://luciarebolino.github.io/HS26_Internet-Architecture/board/</w:t>
-        </w:r>
-      </w:hyperlink>
-    </w:p>
-    <w:p>
-      <w:r>
-        <w:rPr>
-          <w:rFonts w:ascii="Arial" w:cs="Arial" w:eastAsia="Arial" w:hAnsi="Arial"/>
-        </w:rPr>
         <w:t xml:space="preserve">You don't need to know how to code. Each exercise is a short series of steps: you type one command in the terminal, it does one thing, saves the result in a folder and tells you what to do next.</w:t>
       </w:r>
     </w:p>
@@ -729,7 +697,7 @@
         </w:rPr>
         <w:t xml:space="preserve">, the editor where you'll do everything: </w:t>
       </w:r>
-      <w:hyperlink w:history="1" r:id="rIdkgsijz5tynke9yzw0l4np">
+      <w:hyperlink w:history="1" r:id="rIdaid2mzpkqqttm4-db3924">
         <w:r>
           <w:rPr>
             <w:rFonts w:ascii="Arial" w:cs="Arial" w:eastAsia="Arial" w:hAnsi="Arial"/>
@@ -762,7 +730,7 @@
         </w:rPr>
         <w:t xml:space="preserve">, which runs JavaScript files on your computer: </w:t>
       </w:r>
-      <w:hyperlink w:history="1" r:id="rIda58rfg6eetnkkgoitthyt">
+      <w:hyperlink w:history="1" r:id="rIdyd2wzmrsc1w6kjzzlbqjx">
         <w:r>
           <w:rPr>
             <w:rFonts w:ascii="Arial" w:cs="Arial" w:eastAsia="Arial" w:hAnsi="Arial"/>
@@ -1241,7 +1209,7 @@
         </w:rPr>
         <w:t xml:space="preserve"> Go to </w:t>
       </w:r>
-      <w:hyperlink w:history="1" r:id="rIdixbnycj2-pkxvotgjdfja">
+      <w:hyperlink w:history="1" r:id="rIdook_ocz1-y1uniptiwiae">
         <w:r>
           <w:rPr>
             <w:rFonts w:ascii="Arial" w:cs="Arial" w:eastAsia="Arial" w:hAnsi="Arial"/>
@@ -1280,7 +1248,7 @@
         </w:rPr>
         <w:t xml:space="preserve"> (a folder for your keys and settings): </w:t>
       </w:r>
-      <w:hyperlink w:history="1" r:id="rId_fiqakx2vfciutnyex1ph">
+      <w:hyperlink w:history="1" r:id="rIdh_4es_dnn-7kk-h8unr2r">
         <w:r>
           <w:rPr>
             <w:rFonts w:ascii="Arial" w:cs="Arial" w:eastAsia="Arial" w:hAnsi="Arial"/>
@@ -1347,7 +1315,7 @@
         </w:rPr>
         <w:t xml:space="preserve"> </w:t>
       </w:r>
-      <w:hyperlink w:history="1" r:id="rId5pssu55condeq58h_qa-l">
+      <w:hyperlink w:history="1" r:id="rId9li9txlqm7vsvjbq9nhwk">
         <w:r>
           <w:rPr>
             <w:rFonts w:ascii="Arial" w:cs="Arial" w:eastAsia="Arial" w:hAnsi="Arial"/>
@@ -1442,7 +1410,7 @@
         </w:rPr>
         <w:t xml:space="preserve"> (3D tiles, exercise 1): </w:t>
       </w:r>
-      <w:hyperlink w:history="1" r:id="rIdrnqnzsmlskxpsps_pcoep">
+      <w:hyperlink w:history="1" r:id="rIdjj9sjrczwugigae9vlfxk">
         <w:r>
           <w:rPr>
             <w:rFonts w:ascii="Arial" w:cs="Arial" w:eastAsia="Arial" w:hAnsi="Arial"/>
@@ -1472,7 +1440,7 @@
         </w:rPr>
         <w:t xml:space="preserve"> (exercise 2): </w:t>
       </w:r>
-      <w:hyperlink w:history="1" r:id="rId4vbec1gsqiagzh7iyrd13">
+      <w:hyperlink w:history="1" r:id="rIdpf4-a6ej8iu-hpwf2gxcs">
         <w:r>
           <w:rPr>
             <w:rFonts w:ascii="Arial" w:cs="Arial" w:eastAsia="Arial" w:hAnsi="Arial"/>
@@ -1505,7 +1473,7 @@
         </w:rPr>
         <w:t xml:space="preserve"> </w:t>
       </w:r>
-      <w:hyperlink w:history="1" r:id="rIdnm7s2yyd7z4pzk-v4rbwt">
+      <w:hyperlink w:history="1" r:id="rIdgdjgcfrkj7cmla8nk9kwi">
         <w:r>
           <w:rPr>
             <w:rFonts w:ascii="Arial" w:cs="Arial" w:eastAsia="Arial" w:hAnsi="Arial"/>
@@ -1693,7 +1661,7 @@
         </w:rPr>
         <w:t xml:space="preserve"> so Google emails you before anything costs money: </w:t>
       </w:r>
-      <w:hyperlink w:history="1" r:id="rIdqk5xs6mky0nm41y2mvupe">
+      <w:hyperlink w:history="1" r:id="rId0v9cd5n8nyqgkccvxqft5">
         <w:r>
           <w:rPr>
             <w:rFonts w:ascii="Arial" w:cs="Arial" w:eastAsia="Arial" w:hAnsi="Arial"/>
@@ -1790,7 +1758,7 @@
         </w:rPr>
         <w:t xml:space="preserve"> Google gives a free allowance every month (</w:t>
       </w:r>
-      <w:hyperlink w:history="1" r:id="rIdtfzvoz9hl63y9aysa_cxp">
+      <w:hyperlink w:history="1" r:id="rIdyzfl9urwfmejnx77ysu5w">
         <w:r>
           <w:rPr>
             <w:rFonts w:ascii="Arial" w:cs="Arial" w:eastAsia="Arial" w:hAnsi="Arial"/>
@@ -2272,7 +2240,7 @@
         </w:rPr>
         <w:t xml:space="preserve">Official guides, if you get stuck: </w:t>
       </w:r>
-      <w:hyperlink w:history="1" r:id="rId-boqezz24ceblx3mvt3zb">
+      <w:hyperlink w:history="1" r:id="rIdcvm9j7sugyog1l8gxxupu">
         <w:r>
           <w:rPr>
             <w:rFonts w:ascii="Arial" w:cs="Arial" w:eastAsia="Arial" w:hAnsi="Arial"/>
@@ -2288,7 +2256,7 @@
         </w:rPr>
         <w:t xml:space="preserve"> · </w:t>
       </w:r>
-      <w:hyperlink w:history="1" r:id="rIdtfa4ki34kfga8eb1h9dyd">
+      <w:hyperlink w:history="1" r:id="rIdwg67ov8mje2gzzhbx0nu4">
         <w:r>
           <w:rPr>
             <w:rFonts w:ascii="Arial" w:cs="Arial" w:eastAsia="Arial" w:hAnsi="Arial"/>
@@ -3723,7 +3691,7 @@
           <w:numId w:val="6"/>
         </w:numPr>
       </w:pPr>
-      <w:hyperlink w:history="1" r:id="rIdshvmcom2ufw10obf8foki">
+      <w:hyperlink w:history="1" r:id="rIdaikulq5sezlpr_sfc4qw5">
         <w:r>
           <w:rPr>
             <w:rFonts w:ascii="Arial" w:cs="Arial" w:eastAsia="Arial" w:hAnsi="Arial"/>
@@ -3742,7 +3710,7 @@
           <w:numId w:val="6"/>
         </w:numPr>
       </w:pPr>
-      <w:hyperlink w:history="1" r:id="rIdtbr3ebu2fynljj98jwhdn">
+      <w:hyperlink w:history="1" r:id="rIdq_bzh4-bpe95aybuhhapk">
         <w:r>
           <w:rPr>
             <w:rFonts w:ascii="Arial" w:cs="Arial" w:eastAsia="Arial" w:hAnsi="Arial"/>
@@ -3761,7 +3729,7 @@
           <w:numId w:val="6"/>
         </w:numPr>
       </w:pPr>
-      <w:hyperlink w:history="1" r:id="rIdhguohihiacmhif3i9lxcm">
+      <w:hyperlink w:history="1" r:id="rId-xxktcamgazgbnfmefzl2">
         <w:r>
           <w:rPr>
             <w:rFonts w:ascii="Arial" w:cs="Arial" w:eastAsia="Arial" w:hAnsi="Arial"/>
@@ -3780,7 +3748,7 @@
           <w:numId w:val="6"/>
         </w:numPr>
       </w:pPr>
-      <w:hyperlink w:history="1" r:id="rId7i9w6qqn_0otombmr_xtc">
+      <w:hyperlink w:history="1" r:id="rId1pk9mxtaynr7-nei8l6et">
         <w:r>
           <w:rPr>
             <w:rFonts w:ascii="Arial" w:cs="Arial" w:eastAsia="Arial" w:hAnsi="Arial"/>
@@ -3799,7 +3767,7 @@
           <w:numId w:val="6"/>
         </w:numPr>
       </w:pPr>
-      <w:hyperlink w:history="1" r:id="rIdafugg7rg65b_tpqfx1ic_">
+      <w:hyperlink w:history="1" r:id="rIdazlvalqinbuhsunwed0id">
         <w:r>
           <w:rPr>
             <w:rFonts w:ascii="Arial" w:cs="Arial" w:eastAsia="Arial" w:hAnsi="Arial"/>
@@ -3818,7 +3786,7 @@
           <w:numId w:val="6"/>
         </w:numPr>
       </w:pPr>
-      <w:hyperlink w:history="1" r:id="rIdzwhrgylqmqkjl16hvwr_b">
+      <w:hyperlink w:history="1" r:id="rIdoydboxolrggimhjge8zub">
         <w:r>
           <w:rPr>
             <w:rFonts w:ascii="Arial" w:cs="Arial" w:eastAsia="Arial" w:hAnsi="Arial"/>
@@ -3837,7 +3805,7 @@
           <w:numId w:val="6"/>
         </w:numPr>
       </w:pPr>
-      <w:hyperlink w:history="1" r:id="rId-mx2nskhvgawbcpy9ppga">
+      <w:hyperlink w:history="1" r:id="rIdfttu94zsnmuyx91gloqbw">
         <w:r>
           <w:rPr>
             <w:rFonts w:ascii="Arial" w:cs="Arial" w:eastAsia="Arial" w:hAnsi="Arial"/>
@@ -3856,7 +3824,7 @@
           <w:numId w:val="6"/>
         </w:numPr>
       </w:pPr>
-      <w:hyperlink w:history="1" r:id="rId0sbz4ocwp1yolfduuzzdu">
+      <w:hyperlink w:history="1" r:id="rIdqrbp9u1rq2sdzu6o3yiqz">
         <w:r>
           <w:rPr>
             <w:rFonts w:ascii="Arial" w:cs="Arial" w:eastAsia="Arial" w:hAnsi="Arial"/>
@@ -3875,7 +3843,7 @@
           <w:numId w:val="6"/>
         </w:numPr>
       </w:pPr>
-      <w:hyperlink w:history="1" r:id="rIdvvxyjeembwjpr1hgg1tod">
+      <w:hyperlink w:history="1" r:id="rIdtagfc9putyy9pyyunlnlc">
         <w:r>
           <w:rPr>
             <w:rFonts w:ascii="Arial" w:cs="Arial" w:eastAsia="Arial" w:hAnsi="Arial"/>
@@ -3894,7 +3862,7 @@
           <w:numId w:val="6"/>
         </w:numPr>
       </w:pPr>
-      <w:hyperlink w:history="1" r:id="rId7xn2jsgnrtwnpmc7sweqa">
+      <w:hyperlink w:history="1" r:id="rIdwjkvs0yrm-6h_dysfngx-">
         <w:r>
           <w:rPr>
             <w:rFonts w:ascii="Arial" w:cs="Arial" w:eastAsia="Arial" w:hAnsi="Arial"/>
@@ -3913,7 +3881,7 @@
           <w:numId w:val="6"/>
         </w:numPr>
       </w:pPr>
-      <w:hyperlink w:history="1" r:id="rIdrv50zhc38v2qolk9dojh7">
+      <w:hyperlink w:history="1" r:id="rIdudazffgum9he6loo8tc0l">
         <w:r>
           <w:rPr>
             <w:rFonts w:ascii="Arial" w:cs="Arial" w:eastAsia="Arial" w:hAnsi="Arial"/>
@@ -3932,7 +3900,7 @@
           <w:numId w:val="6"/>
         </w:numPr>
       </w:pPr>
-      <w:hyperlink w:history="1" r:id="rId6tf8i7xsdfi_nqr_fnvrb">
+      <w:hyperlink w:history="1" r:id="rIdky_n1pklgb7mjnmpbo0ds">
         <w:r>
           <w:rPr>
             <w:rFonts w:ascii="Arial" w:cs="Arial" w:eastAsia="Arial" w:hAnsi="Arial"/>
@@ -3951,7 +3919,7 @@
           <w:numId w:val="6"/>
         </w:numPr>
       </w:pPr>
-      <w:hyperlink w:history="1" r:id="rIdcpcuitsqtnw4yhl0aitdg">
+      <w:hyperlink w:history="1" r:id="rIddkn4_tto8ogom1841cwae">
         <w:r>
           <w:rPr>
             <w:rFonts w:ascii="Arial" w:cs="Arial" w:eastAsia="Arial" w:hAnsi="Arial"/>

</xml_diff>

<commit_message>
StreetTrack: choose what to look for (any of the 80 things the model knows)
LOOK_FOR setting in the terminal version and a Look for menu in the web
version, zoom that frames tall things like people, tables named after
what was found, and the CSV header back on the first line.
</commit_message>
<xml_diff>
--- a/docs/0 - Internet Architecture.docx
+++ b/docs/0 - Internet Architecture.docx
@@ -318,7 +318,7 @@
             </w:tcMar>
           </w:tcPr>
           <w:p>
-            <w:hyperlink w:history="1" r:id="rId71c-ahi4iszuxarwfe5qa">
+            <w:hyperlink w:history="1" r:id="rIdsrwyoc_3wgbt3htzpu7by">
               <w:r>
                 <w:rPr>
                   <w:rFonts w:ascii="Arial" w:cs="Arial" w:eastAsia="Arial" w:hAnsi="Arial"/>
@@ -465,7 +465,7 @@
             </w:tcMar>
           </w:tcPr>
           <w:p>
-            <w:hyperlink w:history="1" r:id="rId4jkkto627tb1bqlkqzsql">
+            <w:hyperlink w:history="1" r:id="rId2egmbm2xygb0-yrb5fiv8">
               <w:r>
                 <w:rPr>
                   <w:rFonts w:ascii="Arial" w:cs="Arial" w:eastAsia="Arial" w:hAnsi="Arial"/>
@@ -612,7 +612,7 @@
             </w:tcMar>
           </w:tcPr>
           <w:p>
-            <w:hyperlink w:history="1" r:id="rId8-awc8adcctdve63tm0z_">
+            <w:hyperlink w:history="1" r:id="rIdbakqemr6ej-nksewtgueb">
               <w:r>
                 <w:rPr>
                   <w:rFonts w:ascii="Arial" w:cs="Arial" w:eastAsia="Arial" w:hAnsi="Arial"/>
@@ -697,7 +697,7 @@
         </w:rPr>
         <w:t xml:space="preserve">, the editor where you'll do everything: </w:t>
       </w:r>
-      <w:hyperlink w:history="1" r:id="rIdaid2mzpkqqttm4-db3924">
+      <w:hyperlink w:history="1" r:id="rIdaq3_ysbblyn4ibtm-2vea">
         <w:r>
           <w:rPr>
             <w:rFonts w:ascii="Arial" w:cs="Arial" w:eastAsia="Arial" w:hAnsi="Arial"/>
@@ -730,7 +730,7 @@
         </w:rPr>
         <w:t xml:space="preserve">, which runs JavaScript files on your computer: </w:t>
       </w:r>
-      <w:hyperlink w:history="1" r:id="rIdyd2wzmrsc1w6kjzzlbqjx">
+      <w:hyperlink w:history="1" r:id="rIdko5qtf0molkeaw1fhfljk">
         <w:r>
           <w:rPr>
             <w:rFonts w:ascii="Arial" w:cs="Arial" w:eastAsia="Arial" w:hAnsi="Arial"/>
@@ -1209,7 +1209,7 @@
         </w:rPr>
         <w:t xml:space="preserve"> Go to </w:t>
       </w:r>
-      <w:hyperlink w:history="1" r:id="rIdook_ocz1-y1uniptiwiae">
+      <w:hyperlink w:history="1" r:id="rIdgl7wlh5weqhwdry93fl_h">
         <w:r>
           <w:rPr>
             <w:rFonts w:ascii="Arial" w:cs="Arial" w:eastAsia="Arial" w:hAnsi="Arial"/>
@@ -1248,7 +1248,7 @@
         </w:rPr>
         <w:t xml:space="preserve"> (a folder for your keys and settings): </w:t>
       </w:r>
-      <w:hyperlink w:history="1" r:id="rIdh_4es_dnn-7kk-h8unr2r">
+      <w:hyperlink w:history="1" r:id="rIdonkfvax1f4wd2mgpvbrwc">
         <w:r>
           <w:rPr>
             <w:rFonts w:ascii="Arial" w:cs="Arial" w:eastAsia="Arial" w:hAnsi="Arial"/>
@@ -1315,7 +1315,7 @@
         </w:rPr>
         <w:t xml:space="preserve"> </w:t>
       </w:r>
-      <w:hyperlink w:history="1" r:id="rId9li9txlqm7vsvjbq9nhwk">
+      <w:hyperlink w:history="1" r:id="rIdejr2_ssrd-sjaud00p-9b">
         <w:r>
           <w:rPr>
             <w:rFonts w:ascii="Arial" w:cs="Arial" w:eastAsia="Arial" w:hAnsi="Arial"/>
@@ -1410,7 +1410,7 @@
         </w:rPr>
         <w:t xml:space="preserve"> (3D tiles, exercise 1): </w:t>
       </w:r>
-      <w:hyperlink w:history="1" r:id="rIdjj9sjrczwugigae9vlfxk">
+      <w:hyperlink w:history="1" r:id="rIdlskb6xazue3rtkrhels7j">
         <w:r>
           <w:rPr>
             <w:rFonts w:ascii="Arial" w:cs="Arial" w:eastAsia="Arial" w:hAnsi="Arial"/>
@@ -1440,7 +1440,7 @@
         </w:rPr>
         <w:t xml:space="preserve"> (exercise 2): </w:t>
       </w:r>
-      <w:hyperlink w:history="1" r:id="rIdpf4-a6ej8iu-hpwf2gxcs">
+      <w:hyperlink w:history="1" r:id="rIdziggvk1asrmgookkw0wed">
         <w:r>
           <w:rPr>
             <w:rFonts w:ascii="Arial" w:cs="Arial" w:eastAsia="Arial" w:hAnsi="Arial"/>
@@ -1473,7 +1473,7 @@
         </w:rPr>
         <w:t xml:space="preserve"> </w:t>
       </w:r>
-      <w:hyperlink w:history="1" r:id="rIdgdjgcfrkj7cmla8nk9kwi">
+      <w:hyperlink w:history="1" r:id="rIdkob1ndgwhlbj2he4wfbms">
         <w:r>
           <w:rPr>
             <w:rFonts w:ascii="Arial" w:cs="Arial" w:eastAsia="Arial" w:hAnsi="Arial"/>
@@ -1661,7 +1661,7 @@
         </w:rPr>
         <w:t xml:space="preserve"> so Google emails you before anything costs money: </w:t>
       </w:r>
-      <w:hyperlink w:history="1" r:id="rId0v9cd5n8nyqgkccvxqft5">
+      <w:hyperlink w:history="1" r:id="rIdaulnmwnfsf2ywifqxa0dp">
         <w:r>
           <w:rPr>
             <w:rFonts w:ascii="Arial" w:cs="Arial" w:eastAsia="Arial" w:hAnsi="Arial"/>
@@ -1758,7 +1758,7 @@
         </w:rPr>
         <w:t xml:space="preserve"> Google gives a free allowance every month (</w:t>
       </w:r>
-      <w:hyperlink w:history="1" r:id="rIdyzfl9urwfmejnx77ysu5w">
+      <w:hyperlink w:history="1" r:id="rIduaiyynd5dupmqkxbcmgpj">
         <w:r>
           <w:rPr>
             <w:rFonts w:ascii="Arial" w:cs="Arial" w:eastAsia="Arial" w:hAnsi="Arial"/>
@@ -2240,7 +2240,7 @@
         </w:rPr>
         <w:t xml:space="preserve">Official guides, if you get stuck: </w:t>
       </w:r>
-      <w:hyperlink w:history="1" r:id="rIdcvm9j7sugyog1l8gxxupu">
+      <w:hyperlink w:history="1" r:id="rId4xi7hy5-kvwx92fjnfgaw">
         <w:r>
           <w:rPr>
             <w:rFonts w:ascii="Arial" w:cs="Arial" w:eastAsia="Arial" w:hAnsi="Arial"/>
@@ -2256,7 +2256,7 @@
         </w:rPr>
         <w:t xml:space="preserve"> · </w:t>
       </w:r>
-      <w:hyperlink w:history="1" r:id="rIdwg67ov8mje2gzzhbx0nu4">
+      <w:hyperlink w:history="1" r:id="rId5kvfp9ttkuyyaxvg2iuze">
         <w:r>
           <w:rPr>
             <w:rFonts w:ascii="Arial" w:cs="Arial" w:eastAsia="Arial" w:hAnsi="Arial"/>
@@ -3691,7 +3691,7 @@
           <w:numId w:val="6"/>
         </w:numPr>
       </w:pPr>
-      <w:hyperlink w:history="1" r:id="rIdaikulq5sezlpr_sfc4qw5">
+      <w:hyperlink w:history="1" r:id="rIdsrojjxtdw_egw4jkqcqk_">
         <w:r>
           <w:rPr>
             <w:rFonts w:ascii="Arial" w:cs="Arial" w:eastAsia="Arial" w:hAnsi="Arial"/>
@@ -3710,7 +3710,7 @@
           <w:numId w:val="6"/>
         </w:numPr>
       </w:pPr>
-      <w:hyperlink w:history="1" r:id="rIdq_bzh4-bpe95aybuhhapk">
+      <w:hyperlink w:history="1" r:id="rId9nl2jo-kgvvp1wqz0svyn">
         <w:r>
           <w:rPr>
             <w:rFonts w:ascii="Arial" w:cs="Arial" w:eastAsia="Arial" w:hAnsi="Arial"/>
@@ -3729,7 +3729,7 @@
           <w:numId w:val="6"/>
         </w:numPr>
       </w:pPr>
-      <w:hyperlink w:history="1" r:id="rId-xxktcamgazgbnfmefzl2">
+      <w:hyperlink w:history="1" r:id="rIdjevtee5nkeooweu1ukkpz">
         <w:r>
           <w:rPr>
             <w:rFonts w:ascii="Arial" w:cs="Arial" w:eastAsia="Arial" w:hAnsi="Arial"/>
@@ -3748,7 +3748,7 @@
           <w:numId w:val="6"/>
         </w:numPr>
       </w:pPr>
-      <w:hyperlink w:history="1" r:id="rId1pk9mxtaynr7-nei8l6et">
+      <w:hyperlink w:history="1" r:id="rIdrmt3ihbogmdesdxqz7loi">
         <w:r>
           <w:rPr>
             <w:rFonts w:ascii="Arial" w:cs="Arial" w:eastAsia="Arial" w:hAnsi="Arial"/>
@@ -3767,7 +3767,7 @@
           <w:numId w:val="6"/>
         </w:numPr>
       </w:pPr>
-      <w:hyperlink w:history="1" r:id="rIdazlvalqinbuhsunwed0id">
+      <w:hyperlink w:history="1" r:id="rId-slld2uzlorkazbacej5z">
         <w:r>
           <w:rPr>
             <w:rFonts w:ascii="Arial" w:cs="Arial" w:eastAsia="Arial" w:hAnsi="Arial"/>
@@ -3786,7 +3786,7 @@
           <w:numId w:val="6"/>
         </w:numPr>
       </w:pPr>
-      <w:hyperlink w:history="1" r:id="rIdoydboxolrggimhjge8zub">
+      <w:hyperlink w:history="1" r:id="rIddoghsdbyxelcdq26nqfxf">
         <w:r>
           <w:rPr>
             <w:rFonts w:ascii="Arial" w:cs="Arial" w:eastAsia="Arial" w:hAnsi="Arial"/>
@@ -3805,7 +3805,7 @@
           <w:numId w:val="6"/>
         </w:numPr>
       </w:pPr>
-      <w:hyperlink w:history="1" r:id="rIdfttu94zsnmuyx91gloqbw">
+      <w:hyperlink w:history="1" r:id="rIdks86jsmmvnu175n7cf7ta">
         <w:r>
           <w:rPr>
             <w:rFonts w:ascii="Arial" w:cs="Arial" w:eastAsia="Arial" w:hAnsi="Arial"/>
@@ -3824,7 +3824,7 @@
           <w:numId w:val="6"/>
         </w:numPr>
       </w:pPr>
-      <w:hyperlink w:history="1" r:id="rIdqrbp9u1rq2sdzu6o3yiqz">
+      <w:hyperlink w:history="1" r:id="rIdcsxktbnjz0sms3pubbwam">
         <w:r>
           <w:rPr>
             <w:rFonts w:ascii="Arial" w:cs="Arial" w:eastAsia="Arial" w:hAnsi="Arial"/>
@@ -3843,7 +3843,7 @@
           <w:numId w:val="6"/>
         </w:numPr>
       </w:pPr>
-      <w:hyperlink w:history="1" r:id="rIdtagfc9putyy9pyyunlnlc">
+      <w:hyperlink w:history="1" r:id="rIdl0hmxwtjasn2mhfinryey">
         <w:r>
           <w:rPr>
             <w:rFonts w:ascii="Arial" w:cs="Arial" w:eastAsia="Arial" w:hAnsi="Arial"/>
@@ -3862,7 +3862,7 @@
           <w:numId w:val="6"/>
         </w:numPr>
       </w:pPr>
-      <w:hyperlink w:history="1" r:id="rIdwjkvs0yrm-6h_dysfngx-">
+      <w:hyperlink w:history="1" r:id="rIdtjxjhlhunmigmf7tpuyhl">
         <w:r>
           <w:rPr>
             <w:rFonts w:ascii="Arial" w:cs="Arial" w:eastAsia="Arial" w:hAnsi="Arial"/>
@@ -3881,7 +3881,7 @@
           <w:numId w:val="6"/>
         </w:numPr>
       </w:pPr>
-      <w:hyperlink w:history="1" r:id="rIdudazffgum9he6loo8tc0l">
+      <w:hyperlink w:history="1" r:id="rId0gfyj5dbw0h9qx0kevdci">
         <w:r>
           <w:rPr>
             <w:rFonts w:ascii="Arial" w:cs="Arial" w:eastAsia="Arial" w:hAnsi="Arial"/>
@@ -3900,7 +3900,7 @@
           <w:numId w:val="6"/>
         </w:numPr>
       </w:pPr>
-      <w:hyperlink w:history="1" r:id="rIdky_n1pklgb7mjnmpbo0ds">
+      <w:hyperlink w:history="1" r:id="rIdyt-gwpzl1k1r_be_nzdrf">
         <w:r>
           <w:rPr>
             <w:rFonts w:ascii="Arial" w:cs="Arial" w:eastAsia="Arial" w:hAnsi="Arial"/>
@@ -3919,7 +3919,7 @@
           <w:numId w:val="6"/>
         </w:numPr>
       </w:pPr>
-      <w:hyperlink w:history="1" r:id="rIddkn4_tto8ogom1841cwae">
+      <w:hyperlink w:history="1" r:id="rId_ih2u5ejpm2cxfajl0xr6">
         <w:r>
           <w:rPr>
             <w:rFonts w:ascii="Arial" w:cs="Arial" w:eastAsia="Arial" w:hAnsi="Arial"/>

</xml_diff>